<commit_message>
update cv - KPA award
</commit_message>
<xml_diff>
--- a/files/CV_minakwon.docx
+++ b/files/CV_minakwon.docx
@@ -3131,6 +3131,169 @@
           <w:iCs/>
           <w:sz w:val="20"/>
           <w:szCs w:val="20"/>
+          <w:lang w:eastAsia="ko-KR"/>
+        </w:rPr>
+      </w:pPr>
+      <w:r>
+        <w:rPr>
+          <w:rFonts w:ascii="Calibri Light" w:hAnsi="Calibri Light" w:cs="Calibri Light"/>
+          <w:i/>
+          <w:iCs/>
+          <w:sz w:val="20"/>
+          <w:szCs w:val="20"/>
+          <w:lang w:eastAsia="ko-KR"/>
+        </w:rPr>
+        <w:t>Personality Psychology</w:t>
+      </w:r>
+      <w:r>
+        <w:rPr>
+          <w:rFonts w:ascii="Calibri Light" w:hAnsi="Calibri Light" w:cs="Calibri Light"/>
+          <w:i/>
+          <w:iCs/>
+          <w:sz w:val="20"/>
+          <w:szCs w:val="20"/>
+        </w:rPr>
+        <w:tab/>
+      </w:r>
+      <w:r>
+        <w:rPr>
+          <w:rFonts w:ascii="Calibri Light" w:hAnsi="Calibri Light" w:cs="Calibri Light"/>
+          <w:i/>
+          <w:iCs/>
+          <w:sz w:val="20"/>
+          <w:szCs w:val="20"/>
+          <w:lang w:eastAsia="ko-KR"/>
+        </w:rPr>
+        <w:t>202</w:t>
+      </w:r>
+      <w:r>
+        <w:rPr>
+          <w:rFonts w:ascii="Calibri Light" w:hAnsi="Calibri Light" w:cs="Calibri Light"/>
+          <w:i/>
+          <w:iCs/>
+          <w:sz w:val="20"/>
+          <w:szCs w:val="20"/>
+          <w:lang w:eastAsia="ko-KR"/>
+        </w:rPr>
+        <w:t>3</w:t>
+      </w:r>
+      <w:r>
+        <w:rPr>
+          <w:rFonts w:ascii="Calibri Light" w:hAnsi="Calibri Light" w:cs="Calibri Light"/>
+          <w:i/>
+          <w:iCs/>
+          <w:sz w:val="20"/>
+          <w:szCs w:val="20"/>
+          <w:lang w:eastAsia="ko-KR"/>
+        </w:rPr>
+        <w:t>.</w:t>
+      </w:r>
+      <w:r>
+        <w:rPr>
+          <w:rFonts w:ascii="Calibri Light" w:hAnsi="Calibri Light" w:cs="Calibri Light"/>
+          <w:i/>
+          <w:iCs/>
+          <w:sz w:val="20"/>
+          <w:szCs w:val="20"/>
+          <w:lang w:eastAsia="ko-KR"/>
+        </w:rPr>
+        <w:t xml:space="preserve">09 ~ </w:t>
+      </w:r>
+      <w:r>
+        <w:rPr>
+          <w:rFonts w:ascii="Calibri Light" w:hAnsi="Calibri Light" w:cs="Calibri Light"/>
+          <w:i/>
+          <w:iCs/>
+          <w:sz w:val="20"/>
+          <w:szCs w:val="20"/>
+          <w:lang w:eastAsia="ko-KR"/>
+        </w:rPr>
+        <w:t>2023.12</w:t>
+      </w:r>
+    </w:p>
+    <w:p>
+      <w:pPr>
+        <w:tabs>
+          <w:tab w:val="right" w:pos="8640"/>
+        </w:tabs>
+        <w:rPr>
+          <w:rFonts w:ascii="Calibri" w:hAnsi="Calibri" w:cs="Calibri"/>
+          <w:b/>
+          <w:bCs/>
+          <w:sz w:val="22"/>
+          <w:szCs w:val="22"/>
+          <w:lang w:eastAsia="ko-KR"/>
+        </w:rPr>
+      </w:pPr>
+    </w:p>
+    <w:p>
+      <w:pPr>
+        <w:tabs>
+          <w:tab w:val="right" w:pos="8640"/>
+        </w:tabs>
+        <w:rPr>
+          <w:rFonts w:ascii="Calibri Light" w:hAnsi="Calibri Light" w:cs="Calibri Light"/>
+          <w:i/>
+          <w:iCs/>
+          <w:sz w:val="20"/>
+          <w:szCs w:val="20"/>
+        </w:rPr>
+      </w:pPr>
+      <w:r>
+        <w:rPr>
+          <w:rFonts w:ascii="Calibri" w:hAnsi="Calibri" w:cs="Calibri"/>
+          <w:b/>
+          <w:bCs/>
+          <w:sz w:val="22"/>
+          <w:szCs w:val="22"/>
+          <w:lang w:eastAsia="ko-KR"/>
+        </w:rPr>
+        <w:t>Seoul National University</w:t>
+      </w:r>
+    </w:p>
+    <w:p>
+      <w:pPr>
+        <w:tabs>
+          <w:tab w:val="right" w:pos="8640"/>
+        </w:tabs>
+        <w:rPr>
+          <w:rFonts w:ascii="Calibri Light" w:hAnsi="Calibri Light" w:cs="Calibri Light"/>
+          <w:i/>
+          <w:iCs/>
+          <w:sz w:val="20"/>
+          <w:szCs w:val="20"/>
+        </w:rPr>
+      </w:pPr>
+      <w:r>
+        <w:rPr>
+          <w:rFonts w:ascii="Calibri Light" w:hAnsi="Calibri Light" w:cs="Calibri Light"/>
+          <w:sz w:val="20"/>
+          <w:szCs w:val="20"/>
+          <w:lang w:eastAsia="ko-KR"/>
+        </w:rPr>
+        <w:t xml:space="preserve">Teaching Assistant </w:t>
+      </w:r>
+      <w:r>
+        <w:rPr>
+          <w:rFonts w:ascii="Calibri Light" w:hAnsi="Calibri Light" w:cs="Calibri Light"/>
+          <w:sz w:val="20"/>
+          <w:szCs w:val="20"/>
+          <w:lang w:eastAsia="ko-KR"/>
+        </w:rPr>
+        <w:tab/>
+      </w:r>
+    </w:p>
+    <w:p>
+      <w:pPr>
+        <w:tabs>
+          <w:tab w:val="right" w:pos="8640"/>
+        </w:tabs>
+        <w:rPr>
+          <w:rFonts w:ascii="Calibri Light" w:hAnsi="Calibri Light" w:cs="Calibri Light"/>
+          <w:i/>
+          <w:iCs/>
+          <w:sz w:val="20"/>
+          <w:szCs w:val="20"/>
         </w:rPr>
       </w:pPr>
       <w:r>
@@ -3253,36 +3416,23 @@
           <w:szCs w:val="20"/>
           <w:lang w:eastAsia="ko-KR"/>
         </w:rPr>
-        <w:t>9</w:t>
-      </w:r>
-      <w:r>
-        <w:rPr>
-          <w:rFonts w:ascii="Calibri Light" w:hAnsi="Calibri Light" w:cs="Calibri Light"/>
-          <w:i/>
-          <w:iCs/>
-          <w:sz w:val="20"/>
-          <w:szCs w:val="20"/>
-          <w:lang w:eastAsia="ko-KR"/>
-        </w:rPr>
-        <w:t>.</w:t>
-      </w:r>
-      <w:r>
-        <w:rPr>
-          <w:rFonts w:ascii="Calibri Light" w:hAnsi="Calibri Light" w:cs="Calibri Light"/>
-          <w:i/>
-          <w:iCs/>
-          <w:sz w:val="20"/>
-          <w:szCs w:val="20"/>
-          <w:lang w:eastAsia="ko-KR"/>
-        </w:rPr>
-        <w:t xml:space="preserve"> ~ 2022.12</w:t>
-      </w:r>
-    </w:p>
-    <w:p>
-      <w:pPr>
-        <w:tabs>
-          <w:tab w:val="right" w:pos="8640"/>
-        </w:tabs>
+        <w:t>9 ~ 2022.12</w:t>
+      </w:r>
+    </w:p>
+    <w:p>
+      <w:pPr>
+        <w:tabs>
+          <w:tab w:val="right" w:pos="8640"/>
+        </w:tabs>
+        <w:rPr>
+          <w:rFonts w:ascii="Calibri Light" w:hAnsi="Calibri Light" w:cs="Calibri Light"/>
+          <w:i/>
+          <w:iCs/>
+          <w:sz w:val="20"/>
+          <w:szCs w:val="20"/>
+        </w:rPr>
+      </w:pPr>
+      <w:r>
         <w:rPr>
           <w:rFonts w:ascii="Calibri" w:hAnsi="Calibri" w:cs="Calibri"/>
           <w:b/>
@@ -3291,21 +3441,9 @@
           <w:szCs w:val="22"/>
           <w:lang w:eastAsia="ko-KR"/>
         </w:rPr>
-      </w:pPr>
-    </w:p>
-    <w:p>
-      <w:pPr>
-        <w:tabs>
-          <w:tab w:val="right" w:pos="8640"/>
-        </w:tabs>
-        <w:rPr>
-          <w:rFonts w:ascii="Calibri Light" w:hAnsi="Calibri Light" w:cs="Calibri Light"/>
-          <w:i/>
-          <w:iCs/>
-          <w:sz w:val="20"/>
-          <w:szCs w:val="20"/>
-        </w:rPr>
-      </w:pPr>
+        <w:lastRenderedPageBreak/>
+        <w:t>Computational Psychiatry Course</w:t>
+      </w:r>
       <w:r>
         <w:rPr>
           <w:rFonts w:ascii="Calibri" w:hAnsi="Calibri" w:cs="Calibri"/>
@@ -3315,7 +3453,7 @@
           <w:szCs w:val="22"/>
           <w:lang w:eastAsia="ko-KR"/>
         </w:rPr>
-        <w:t>Computational Psychiatry Course</w:t>
+        <w:t xml:space="preserve"> </w:t>
       </w:r>
       <w:r>
         <w:rPr>
@@ -3326,22 +3464,169 @@
           <w:szCs w:val="22"/>
           <w:lang w:eastAsia="ko-KR"/>
         </w:rPr>
-        <w:t xml:space="preserve"> </w:t>
+        <w:t xml:space="preserve">Zurich </w:t>
       </w:r>
       <w:r>
         <w:rPr>
           <w:rFonts w:ascii="Calibri" w:hAnsi="Calibri" w:cs="Calibri"/>
           <w:b/>
+          <w:sz w:val="22"/>
+          <w:szCs w:val="22"/>
+          <w:lang w:eastAsia="ko-KR"/>
+        </w:rPr>
+        <w:tab/>
+      </w:r>
+    </w:p>
+    <w:p>
+      <w:pPr>
+        <w:tabs>
+          <w:tab w:val="right" w:pos="8640"/>
+        </w:tabs>
+        <w:rPr>
+          <w:rFonts w:ascii="Calibri Light" w:hAnsi="Calibri Light" w:cs="Calibri Light"/>
+          <w:i/>
+          <w:iCs/>
+          <w:sz w:val="20"/>
+          <w:szCs w:val="20"/>
+        </w:rPr>
+      </w:pPr>
+      <w:r>
+        <w:rPr>
+          <w:rFonts w:ascii="Calibri Light" w:hAnsi="Calibri Light" w:cs="Calibri Light"/>
+          <w:sz w:val="20"/>
+          <w:szCs w:val="20"/>
+          <w:lang w:eastAsia="ko-KR"/>
+        </w:rPr>
+        <w:t xml:space="preserve">Teaching Assistant </w:t>
+      </w:r>
+      <w:r>
+        <w:rPr>
+          <w:rFonts w:ascii="Calibri Light" w:hAnsi="Calibri Light" w:cs="Calibri Light"/>
+          <w:sz w:val="20"/>
+          <w:szCs w:val="20"/>
+          <w:lang w:eastAsia="ko-KR"/>
+        </w:rPr>
+        <w:tab/>
+      </w:r>
+    </w:p>
+    <w:p>
+      <w:pPr>
+        <w:tabs>
+          <w:tab w:val="right" w:pos="8640"/>
+        </w:tabs>
+        <w:rPr>
+          <w:rFonts w:ascii="Calibri Light" w:hAnsi="Calibri Light" w:cs="Calibri Light"/>
+          <w:i/>
+          <w:iCs/>
+          <w:sz w:val="20"/>
+          <w:szCs w:val="20"/>
+          <w:lang w:eastAsia="ko-KR"/>
+        </w:rPr>
+      </w:pPr>
+      <w:r>
+        <w:rPr>
+          <w:rFonts w:ascii="Calibri Light" w:hAnsi="Calibri Light" w:cs="Calibri Light"/>
+          <w:i/>
+          <w:iCs/>
+          <w:sz w:val="20"/>
+          <w:szCs w:val="20"/>
+        </w:rPr>
+        <w:t xml:space="preserve">Reinforcement Learning using the </w:t>
+      </w:r>
+      <w:proofErr w:type="spellStart"/>
+      <w:r>
+        <w:rPr>
+          <w:rFonts w:ascii="Calibri Light" w:hAnsi="Calibri Light" w:cs="Calibri Light"/>
+          <w:i/>
+          <w:iCs/>
+          <w:sz w:val="20"/>
+          <w:szCs w:val="20"/>
+        </w:rPr>
+        <w:t>hBayesDM</w:t>
+      </w:r>
+      <w:proofErr w:type="spellEnd"/>
+      <w:r>
+        <w:rPr>
+          <w:rFonts w:ascii="Calibri Light" w:hAnsi="Calibri Light" w:cs="Calibri Light"/>
+          <w:i/>
+          <w:iCs/>
+          <w:sz w:val="20"/>
+          <w:szCs w:val="20"/>
+        </w:rPr>
+        <w:t xml:space="preserve"> Package</w:t>
+      </w:r>
+      <w:r>
+        <w:rPr>
+          <w:rFonts w:ascii="Calibri Light" w:hAnsi="Calibri Light" w:cs="Calibri Light"/>
+          <w:i/>
+          <w:iCs/>
+          <w:sz w:val="20"/>
+          <w:szCs w:val="20"/>
+        </w:rPr>
+        <w:tab/>
+      </w:r>
+      <w:r>
+        <w:rPr>
+          <w:rFonts w:ascii="Calibri Light" w:hAnsi="Calibri Light" w:cs="Calibri Light"/>
+          <w:i/>
+          <w:iCs/>
+          <w:sz w:val="20"/>
+          <w:szCs w:val="20"/>
+          <w:lang w:eastAsia="ko-KR"/>
+        </w:rPr>
+        <w:t>2021.</w:t>
+      </w:r>
+      <w:r>
+        <w:rPr>
+          <w:rFonts w:ascii="Calibri Light" w:hAnsi="Calibri Light" w:cs="Calibri Light"/>
+          <w:i/>
+          <w:iCs/>
+          <w:sz w:val="20"/>
+          <w:szCs w:val="20"/>
+          <w:lang w:eastAsia="ko-KR"/>
+        </w:rPr>
+        <w:t>09</w:t>
+      </w:r>
+    </w:p>
+    <w:p>
+      <w:pPr>
+        <w:tabs>
+          <w:tab w:val="right" w:pos="8640"/>
+        </w:tabs>
+        <w:rPr>
+          <w:rFonts w:ascii="Calibri" w:hAnsi="Calibri" w:cs="Calibri"/>
+          <w:b/>
           <w:bCs/>
           <w:sz w:val="22"/>
           <w:szCs w:val="22"/>
           <w:lang w:eastAsia="ko-KR"/>
         </w:rPr>
-        <w:t xml:space="preserve">Zurich </w:t>
-      </w:r>
-      <w:r>
+      </w:pPr>
+    </w:p>
+    <w:p>
+      <w:pPr>
+        <w:tabs>
+          <w:tab w:val="right" w:pos="8640"/>
+        </w:tabs>
         <w:rPr>
           <w:rFonts w:ascii="Calibri" w:hAnsi="Calibri" w:cs="Calibri"/>
+          <w:lang w:eastAsia="ko-KR"/>
+        </w:rPr>
+      </w:pPr>
+      <w:r>
+        <w:rPr>
+          <w:rFonts w:ascii="Calibri" w:hAnsi="Calibri" w:cs="Calibri"/>
+          <w:b/>
+          <w:bCs/>
+          <w:sz w:val="22"/>
+          <w:szCs w:val="22"/>
+          <w:lang w:eastAsia="ko-KR"/>
+        </w:rPr>
+        <w:t>Seoul National University</w:t>
+      </w:r>
+      <w:r>
+        <w:rPr>
+          <w:rFonts w:ascii="Calibri" w:hAnsi="Calibri" w:cs="Calibri"/>
           <w:b/>
           <w:sz w:val="22"/>
           <w:szCs w:val="22"/>
@@ -3404,29 +3689,17 @@
           <w:sz w:val="20"/>
           <w:szCs w:val="20"/>
         </w:rPr>
-        <w:t xml:space="preserve">Reinforcement Learning using the </w:t>
-      </w:r>
-      <w:proofErr w:type="spellStart"/>
-      <w:r>
-        <w:rPr>
-          <w:rFonts w:ascii="Calibri Light" w:hAnsi="Calibri Light" w:cs="Calibri Light"/>
-          <w:i/>
-          <w:iCs/>
-          <w:sz w:val="20"/>
-          <w:szCs w:val="20"/>
-        </w:rPr>
-        <w:t>hBayesDM</w:t>
-      </w:r>
-      <w:proofErr w:type="spellEnd"/>
-      <w:r>
-        <w:rPr>
-          <w:rFonts w:ascii="Calibri Light" w:hAnsi="Calibri Light" w:cs="Calibri Light"/>
-          <w:i/>
-          <w:iCs/>
-          <w:sz w:val="20"/>
-          <w:szCs w:val="20"/>
-        </w:rPr>
-        <w:t xml:space="preserve"> Package</w:t>
+        <w:t>Seminar in Experimental Psychology</w:t>
+      </w:r>
+      <w:r>
+        <w:rPr>
+          <w:rFonts w:ascii="Calibri Light" w:hAnsi="Calibri Light" w:cs="Calibri Light"/>
+          <w:i/>
+          <w:iCs/>
+          <w:sz w:val="20"/>
+          <w:szCs w:val="20"/>
+        </w:rPr>
+        <w:t>: Computational Modeling</w:t>
       </w:r>
       <w:r>
         <w:rPr>
@@ -3447,18 +3720,17 @@
           <w:szCs w:val="20"/>
           <w:lang w:eastAsia="ko-KR"/>
         </w:rPr>
-        <w:t>2021.</w:t>
-      </w:r>
-      <w:r>
-        <w:rPr>
-          <w:rFonts w:ascii="Calibri Light" w:hAnsi="Calibri Light" w:cs="Calibri Light"/>
-          <w:i/>
-          <w:iCs/>
-          <w:sz w:val="20"/>
-          <w:szCs w:val="20"/>
-          <w:lang w:eastAsia="ko-KR"/>
-        </w:rPr>
-        <w:t>09.</w:t>
+        <w:t xml:space="preserve">2021.03 ~ </w:t>
+      </w:r>
+      <w:r>
+        <w:rPr>
+          <w:rFonts w:ascii="Calibri Light" w:hAnsi="Calibri Light" w:cs="Calibri Light"/>
+          <w:i/>
+          <w:iCs/>
+          <w:sz w:val="20"/>
+          <w:szCs w:val="20"/>
+        </w:rPr>
+        <w:t>2021.08</w:t>
       </w:r>
     </w:p>
     <w:p>
@@ -3475,136 +3747,6 @@
           <w:lang w:eastAsia="ko-KR"/>
         </w:rPr>
       </w:pPr>
-    </w:p>
-    <w:p>
-      <w:pPr>
-        <w:tabs>
-          <w:tab w:val="right" w:pos="8640"/>
-        </w:tabs>
-        <w:rPr>
-          <w:rFonts w:ascii="Calibri" w:hAnsi="Calibri" w:cs="Calibri"/>
-          <w:lang w:eastAsia="ko-KR"/>
-        </w:rPr>
-      </w:pPr>
-      <w:r>
-        <w:rPr>
-          <w:rFonts w:ascii="Calibri" w:hAnsi="Calibri" w:cs="Calibri"/>
-          <w:b/>
-          <w:bCs/>
-          <w:sz w:val="22"/>
-          <w:szCs w:val="22"/>
-          <w:lang w:eastAsia="ko-KR"/>
-        </w:rPr>
-        <w:t>Seoul National University</w:t>
-      </w:r>
-      <w:r>
-        <w:rPr>
-          <w:rFonts w:ascii="Calibri" w:hAnsi="Calibri" w:cs="Calibri"/>
-          <w:b/>
-          <w:sz w:val="22"/>
-          <w:szCs w:val="22"/>
-          <w:lang w:eastAsia="ko-KR"/>
-        </w:rPr>
-        <w:tab/>
-      </w:r>
-    </w:p>
-    <w:p>
-      <w:pPr>
-        <w:tabs>
-          <w:tab w:val="right" w:pos="8640"/>
-        </w:tabs>
-        <w:rPr>
-          <w:rFonts w:ascii="Calibri Light" w:hAnsi="Calibri Light" w:cs="Calibri Light"/>
-          <w:i/>
-          <w:iCs/>
-          <w:sz w:val="20"/>
-          <w:szCs w:val="20"/>
-        </w:rPr>
-      </w:pPr>
-      <w:r>
-        <w:rPr>
-          <w:rFonts w:ascii="Calibri Light" w:hAnsi="Calibri Light" w:cs="Calibri Light"/>
-          <w:sz w:val="20"/>
-          <w:szCs w:val="20"/>
-          <w:lang w:eastAsia="ko-KR"/>
-        </w:rPr>
-        <w:t xml:space="preserve">Teaching Assistant </w:t>
-      </w:r>
-      <w:r>
-        <w:rPr>
-          <w:rFonts w:ascii="Calibri Light" w:hAnsi="Calibri Light" w:cs="Calibri Light"/>
-          <w:sz w:val="20"/>
-          <w:szCs w:val="20"/>
-          <w:lang w:eastAsia="ko-KR"/>
-        </w:rPr>
-        <w:tab/>
-      </w:r>
-    </w:p>
-    <w:p>
-      <w:pPr>
-        <w:tabs>
-          <w:tab w:val="right" w:pos="8640"/>
-        </w:tabs>
-        <w:rPr>
-          <w:rFonts w:ascii="Calibri Light" w:hAnsi="Calibri Light" w:cs="Calibri Light"/>
-          <w:i/>
-          <w:iCs/>
-          <w:sz w:val="20"/>
-          <w:szCs w:val="20"/>
-          <w:lang w:eastAsia="ko-KR"/>
-        </w:rPr>
-      </w:pPr>
-      <w:r>
-        <w:rPr>
-          <w:rFonts w:ascii="Calibri Light" w:hAnsi="Calibri Light" w:cs="Calibri Light"/>
-          <w:i/>
-          <w:iCs/>
-          <w:sz w:val="20"/>
-          <w:szCs w:val="20"/>
-        </w:rPr>
-        <w:t>Seminar in Experimental Psychology</w:t>
-      </w:r>
-      <w:r>
-        <w:rPr>
-          <w:rFonts w:ascii="Calibri Light" w:hAnsi="Calibri Light" w:cs="Calibri Light"/>
-          <w:i/>
-          <w:iCs/>
-          <w:sz w:val="20"/>
-          <w:szCs w:val="20"/>
-        </w:rPr>
-        <w:t>: Computational Modeling</w:t>
-      </w:r>
-      <w:r>
-        <w:rPr>
-          <w:rFonts w:ascii="Calibri Light" w:hAnsi="Calibri Light" w:cs="Calibri Light"/>
-          <w:i/>
-          <w:iCs/>
-          <w:sz w:val="20"/>
-          <w:szCs w:val="20"/>
-        </w:rPr>
-        <w:tab/>
-      </w:r>
-      <w:r>
-        <w:rPr>
-          <w:rFonts w:ascii="Calibri Light" w:hAnsi="Calibri Light" w:cs="Calibri Light"/>
-          <w:i/>
-          <w:iCs/>
-          <w:sz w:val="20"/>
-          <w:szCs w:val="20"/>
-          <w:lang w:eastAsia="ko-KR"/>
-        </w:rPr>
-        <w:t xml:space="preserve">2021.03 ~ </w:t>
-      </w:r>
-      <w:r>
-        <w:rPr>
-          <w:rFonts w:ascii="Calibri Light" w:hAnsi="Calibri Light" w:cs="Calibri Light"/>
-          <w:i/>
-          <w:iCs/>
-          <w:sz w:val="20"/>
-          <w:szCs w:val="20"/>
-        </w:rPr>
-        <w:t>2021.08</w:t>
-      </w:r>
     </w:p>
     <w:p>
       <w:pPr>
@@ -4499,18 +4641,6 @@
         </w:tabs>
         <w:rPr>
           <w:rFonts w:ascii="Calibri Light" w:hAnsi="Calibri Light" w:cs="Calibri Light"/>
-          <w:sz w:val="18"/>
-          <w:szCs w:val="18"/>
-        </w:rPr>
-      </w:pPr>
-    </w:p>
-    <w:p>
-      <w:pPr>
-        <w:tabs>
-          <w:tab w:val="right" w:pos="8640"/>
-        </w:tabs>
-        <w:rPr>
-          <w:rFonts w:ascii="Calibri Light" w:hAnsi="Calibri Light" w:cs="Calibri Light"/>
           <w:b/>
           <w:bCs/>
           <w:sz w:val="22"/>
@@ -4891,8 +5021,13 @@
       <w:pPr>
         <w:rPr>
           <w:rFonts w:ascii="Lato" w:hAnsi="Lato" w:cstheme="minorHAnsi"/>
-          <w:sz w:val="22"/>
-          <w:szCs w:val="22"/>
+          <w:b/>
+          <w:bCs/>
+          <w:smallCaps/>
+          <w:kern w:val="32"/>
+          <w:sz w:val="26"/>
+          <w:szCs w:val="26"/>
+          <w:lang w:eastAsia="ko-KR"/>
         </w:rPr>
       </w:pPr>
     </w:p>
@@ -5067,11 +5202,6 @@
       </w:r>
     </w:p>
     <w:p>
-      <w:r>
-        <w:br/>
-      </w:r>
-    </w:p>
-    <w:p>
       <w:pPr>
         <w:pStyle w:val="Heading1"/>
         <w:rPr>
@@ -5242,6 +5372,129 @@
           <w:szCs w:val="26"/>
         </w:rPr>
         <w:t>nd Awards</w:t>
+      </w:r>
+    </w:p>
+    <w:p>
+      <w:pPr>
+        <w:tabs>
+          <w:tab w:val="right" w:pos="8640"/>
+        </w:tabs>
+        <w:rPr>
+          <w:rFonts w:ascii="Calibri Light" w:hAnsi="Calibri Light" w:cs="Calibri Light"/>
+          <w:b/>
+          <w:bCs/>
+          <w:sz w:val="22"/>
+          <w:szCs w:val="22"/>
+        </w:rPr>
+      </w:pPr>
+    </w:p>
+    <w:p>
+      <w:pPr>
+        <w:tabs>
+          <w:tab w:val="right" w:pos="8640"/>
+        </w:tabs>
+        <w:rPr>
+          <w:rFonts w:ascii="Calibri Light" w:hAnsi="Calibri Light" w:cs="Calibri Light"/>
+          <w:i/>
+          <w:iCs/>
+          <w:sz w:val="20"/>
+          <w:szCs w:val="20"/>
+          <w:lang w:eastAsia="ko-KR"/>
+        </w:rPr>
+      </w:pPr>
+      <w:r>
+        <w:rPr>
+          <w:rFonts w:ascii="Calibri Light" w:hAnsi="Calibri Light" w:cs="Calibri Light"/>
+          <w:b/>
+          <w:bCs/>
+          <w:sz w:val="22"/>
+          <w:szCs w:val="22"/>
+          <w:lang w:eastAsia="ko-KR"/>
+        </w:rPr>
+        <w:t xml:space="preserve">Excellence Award in </w:t>
+      </w:r>
+      <w:r>
+        <w:rPr>
+          <w:rFonts w:ascii="Calibri Light" w:hAnsi="Calibri Light" w:cs="Calibri Light"/>
+          <w:b/>
+          <w:bCs/>
+          <w:sz w:val="22"/>
+          <w:szCs w:val="22"/>
+        </w:rPr>
+        <w:t>Doctoral Colloquium</w:t>
+      </w:r>
+      <w:r>
+        <w:rPr>
+          <w:rFonts w:ascii="Calibri Light" w:hAnsi="Calibri Light" w:cs="Calibri Light"/>
+          <w:sz w:val="22"/>
+          <w:szCs w:val="22"/>
+        </w:rPr>
+        <w:tab/>
+      </w:r>
+      <w:r>
+        <w:rPr>
+          <w:rFonts w:ascii="Calibri Light" w:hAnsi="Calibri Light" w:cs="Calibri Light"/>
+          <w:i/>
+          <w:iCs/>
+          <w:sz w:val="20"/>
+          <w:szCs w:val="20"/>
+        </w:rPr>
+        <w:t>202</w:t>
+      </w:r>
+      <w:r>
+        <w:rPr>
+          <w:rFonts w:ascii="Calibri Light" w:hAnsi="Calibri Light" w:cs="Calibri Light"/>
+          <w:i/>
+          <w:iCs/>
+          <w:sz w:val="20"/>
+          <w:szCs w:val="20"/>
+        </w:rPr>
+        <w:t>3</w:t>
+      </w:r>
+      <w:r>
+        <w:rPr>
+          <w:rFonts w:ascii="Calibri Light" w:hAnsi="Calibri Light" w:cs="Calibri Light"/>
+          <w:i/>
+          <w:iCs/>
+          <w:sz w:val="20"/>
+          <w:szCs w:val="20"/>
+        </w:rPr>
+        <w:t>.0</w:t>
+      </w:r>
+      <w:r>
+        <w:rPr>
+          <w:rFonts w:ascii="Calibri Light" w:hAnsi="Calibri Light" w:cs="Calibri Light"/>
+          <w:i/>
+          <w:iCs/>
+          <w:sz w:val="20"/>
+          <w:szCs w:val="20"/>
+        </w:rPr>
+        <w:t>8</w:t>
+      </w:r>
+    </w:p>
+    <w:p>
+      <w:pPr>
+        <w:tabs>
+          <w:tab w:val="right" w:pos="8640"/>
+        </w:tabs>
+        <w:rPr>
+          <w:rFonts w:ascii="Calibri Light" w:hAnsi="Calibri Light" w:cs="Calibri Light"/>
+          <w:i/>
+          <w:iCs/>
+          <w:sz w:val="20"/>
+          <w:szCs w:val="20"/>
+        </w:rPr>
+      </w:pPr>
+      <w:r>
+        <w:rPr>
+          <w:rFonts w:ascii="Calibri Light" w:hAnsi="Calibri Light" w:cs="Calibri Light"/>
+          <w:i/>
+          <w:iCs/>
+          <w:sz w:val="20"/>
+          <w:szCs w:val="20"/>
+          <w:lang w:eastAsia="ko-KR"/>
+        </w:rPr>
+        <w:t>2023 Annual Conference of the Korean Psychological Association</w:t>
       </w:r>
     </w:p>
     <w:p>
@@ -6252,11 +6505,8 @@
     <w:p>
       <w:pPr>
         <w:rPr>
-          <w:rFonts w:ascii="Calibri Light" w:hAnsi="Calibri Light" w:cs="Calibri Light"/>
-          <w:i/>
-          <w:iCs/>
-          <w:sz w:val="20"/>
-          <w:szCs w:val="20"/>
+          <w:sz w:val="32"/>
+          <w:szCs w:val="32"/>
         </w:rPr>
       </w:pPr>
     </w:p>
@@ -6332,7 +6582,27 @@
           <w:sz w:val="20"/>
           <w:szCs w:val="20"/>
         </w:rPr>
-        <w:t>08.</w:t>
+        <w:t>0</w:t>
+      </w:r>
+      <w:r>
+        <w:rPr>
+          <w:rFonts w:ascii="Calibri Light" w:hAnsi="Calibri Light" w:cs="Calibri Light"/>
+          <w:i/>
+          <w:iCs/>
+          <w:sz w:val="20"/>
+          <w:szCs w:val="20"/>
+        </w:rPr>
+        <w:t>9</w:t>
+      </w:r>
+      <w:r>
+        <w:rPr>
+          <w:rFonts w:ascii="Calibri Light" w:hAnsi="Calibri Light" w:cs="Calibri Light"/>
+          <w:i/>
+          <w:iCs/>
+          <w:sz w:val="20"/>
+          <w:szCs w:val="20"/>
+        </w:rPr>
+        <w:t>.</w:t>
       </w:r>
       <w:r>
         <w:rPr>
@@ -6355,17 +6625,6 @@
         </w:rPr>
         <w:t>-</w:t>
       </w:r>
-    </w:p>
-    <w:p>
-      <w:pPr>
-        <w:jc w:val="right"/>
-        <w:rPr>
-          <w:rFonts w:ascii="Calibri Light" w:hAnsi="Calibri Light" w:cs="Calibri Light"/>
-          <w:sz w:val="20"/>
-          <w:szCs w:val="20"/>
-          <w:lang w:eastAsia="ko-KR"/>
-        </w:rPr>
-      </w:pPr>
     </w:p>
     <w:sectPr>
       <w:footerReference w:type="default" r:id="rId11"/>

</xml_diff>

<commit_message>
edit soda paper doi
</commit_message>
<xml_diff>
--- a/files/CV_minakwon.docx
+++ b/files/CV_minakwon.docx
@@ -1181,23 +1181,7 @@
           <w:sz w:val="22"/>
           <w:lang w:eastAsia="ko-KR"/>
         </w:rPr>
-        <w:t xml:space="preserve">Neural correlates of </w:t>
-      </w:r>
-      <w:r>
-        <w:rPr>
-          <w:rFonts w:ascii="Calibri Light" w:hAnsi="Calibri Light" w:cs="Calibri Light"/>
-          <w:sz w:val="22"/>
-          <w:lang w:eastAsia="ko-KR"/>
-        </w:rPr>
-        <w:t xml:space="preserve">model-based behavior in </w:t>
-      </w:r>
-      <w:r>
-        <w:rPr>
-          <w:rFonts w:ascii="Calibri Light" w:hAnsi="Calibri Light" w:cs="Calibri Light"/>
-          <w:sz w:val="22"/>
-          <w:lang w:eastAsia="ko-KR"/>
-        </w:rPr>
-        <w:t xml:space="preserve">internet gaming disorder and alcohol use disorder, </w:t>
+        <w:t xml:space="preserve">Neural correlates of model-based behavior in internet gaming disorder and alcohol use disorder, </w:t>
       </w:r>
       <w:proofErr w:type="spellStart"/>
       <w:r>
@@ -1320,7 +1304,7 @@
           <w:sz w:val="22"/>
           <w:lang w:eastAsia="ko-KR"/>
         </w:rPr>
-        <w:t>in press</w:t>
+        <w:t>2023</w:t>
       </w:r>
       <w:r>
         <w:rPr>
@@ -1362,15 +1346,15 @@
           <w:sz w:val="22"/>
           <w:lang w:eastAsia="ko-KR"/>
         </w:rPr>
-        <w:t>, https://doi.org/10.1101/2021.02.17.4317</w:t>
-      </w:r>
-      <w:r>
-        <w:rPr>
-          <w:rFonts w:ascii="Calibri Light" w:hAnsi="Calibri Light" w:cs="Calibri Light"/>
-          <w:sz w:val="22"/>
-          <w:lang w:eastAsia="ko-KR"/>
-        </w:rPr>
-        <w:t>18</w:t>
+        <w:t xml:space="preserve">, </w:t>
+      </w:r>
+      <w:r>
+        <w:rPr>
+          <w:rFonts w:ascii="Calibri Light" w:hAnsi="Calibri Light" w:cs="Calibri Light"/>
+          <w:sz w:val="22"/>
+          <w:lang w:eastAsia="ko-KR"/>
+        </w:rPr>
+        <w:t>https://doi.org/10.1080/10826084.2023.2259471</w:t>
       </w:r>
       <w:r>
         <w:rPr>

</xml_diff>

<commit_message>
update publication, edit typos, update CV
</commit_message>
<xml_diff>
--- a/files/CV_minakwon.docx
+++ b/files/CV_minakwon.docx
@@ -1115,7 +1115,15 @@
           <w:sz w:val="22"/>
           <w:lang w:eastAsia="ko-KR"/>
         </w:rPr>
-        <w:t>, W.</w:t>
+        <w:t xml:space="preserve">, </w:t>
+      </w:r>
+      <w:r>
+        <w:rPr>
+          <w:rFonts w:ascii="Calibri Light" w:hAnsi="Calibri Light" w:cs="Calibri Light"/>
+          <w:sz w:val="22"/>
+          <w:lang w:eastAsia="ko-KR"/>
+        </w:rPr>
+        <w:t>W.-Y.</w:t>
       </w:r>
       <w:r>
         <w:rPr>
@@ -1278,7 +1286,39 @@
           <w:sz w:val="22"/>
           <w:lang w:eastAsia="ko-KR"/>
         </w:rPr>
-        <w:t xml:space="preserve">, J., Lee, T.-H., &amp; </w:t>
+        <w:t>, J.</w:t>
+      </w:r>
+      <w:r>
+        <w:rPr>
+          <w:rFonts w:ascii="Calibri Light" w:hAnsi="Calibri Light" w:cs="Calibri Light"/>
+          <w:sz w:val="22"/>
+          <w:lang w:eastAsia="ko-KR"/>
+        </w:rPr>
+        <w:t>K.</w:t>
+      </w:r>
+      <w:r>
+        <w:rPr>
+          <w:rFonts w:ascii="Calibri Light" w:hAnsi="Calibri Light" w:cs="Calibri Light"/>
+          <w:sz w:val="22"/>
+          <w:lang w:eastAsia="ko-KR"/>
+        </w:rPr>
+        <w:t xml:space="preserve">, Lee, T.-H., </w:t>
+      </w:r>
+      <w:r>
+        <w:rPr>
+          <w:rFonts w:ascii="Calibri Light" w:hAnsi="Calibri Light" w:cs="Calibri Light"/>
+          <w:sz w:val="22"/>
+          <w:lang w:eastAsia="ko-KR"/>
+        </w:rPr>
+        <w:t xml:space="preserve">Bjork, J.M. </w:t>
+      </w:r>
+      <w:r>
+        <w:rPr>
+          <w:rFonts w:ascii="Calibri Light" w:hAnsi="Calibri Light" w:cs="Calibri Light"/>
+          <w:sz w:val="22"/>
+          <w:lang w:eastAsia="ko-KR"/>
+        </w:rPr>
+        <w:t xml:space="preserve">&amp; </w:t>
       </w:r>
       <w:proofErr w:type="spellStart"/>
       <w:r>
@@ -1822,13 +1862,111 @@
       <w:r>
         <w:rPr>
           <w:rFonts w:ascii="Calibri Light" w:hAnsi="Calibri Light" w:cs="Calibri Light"/>
-          <w:b/>
-          <w:bCs/>
+          <w:sz w:val="22"/>
+          <w:lang w:eastAsia="ko-KR"/>
+        </w:rPr>
+        <w:t>, Lee, J.-H.</w:t>
+      </w:r>
+      <w:r>
+        <w:rPr>
+          <w:rFonts w:ascii="Calibri Light" w:hAnsi="Calibri Light" w:cs="Calibri Light"/>
+          <w:sz w:val="22"/>
+          <w:lang w:eastAsia="ko-KR"/>
+        </w:rPr>
+        <w:t xml:space="preserve">, </w:t>
+      </w:r>
+      <w:r>
+        <w:rPr>
+          <w:rFonts w:ascii="Calibri Light" w:hAnsi="Calibri Light" w:cs="Calibri Light"/>
+          <w:sz w:val="22"/>
+          <w:lang w:eastAsia="ko-KR"/>
+        </w:rPr>
+        <w:t xml:space="preserve">Kim, H., Lee, E., </w:t>
+      </w:r>
+      <w:proofErr w:type="spellStart"/>
+      <w:r>
+        <w:rPr>
+          <w:rFonts w:ascii="Calibri Light" w:hAnsi="Calibri Light" w:cs="Calibri Light"/>
+          <w:sz w:val="22"/>
+          <w:lang w:eastAsia="ko-KR"/>
+        </w:rPr>
+        <w:t>Im</w:t>
+      </w:r>
+      <w:proofErr w:type="spellEnd"/>
+      <w:r>
+        <w:rPr>
+          <w:rFonts w:ascii="Calibri Light" w:hAnsi="Calibri Light" w:cs="Calibri Light"/>
+          <w:sz w:val="22"/>
+          <w:lang w:eastAsia="ko-KR"/>
+        </w:rPr>
+        <w:t xml:space="preserve">, J.J., Doh, H., Yang, J., Pitt, M.A., Myung, J.I., Park, H., Joh, H., &amp; </w:t>
+      </w:r>
+      <w:proofErr w:type="spellStart"/>
+      <w:r>
+        <w:rPr>
+          <w:rFonts w:ascii="Calibri Light" w:hAnsi="Calibri Light" w:cs="Calibri Light"/>
+          <w:sz w:val="22"/>
+          <w:lang w:eastAsia="ko-KR"/>
+        </w:rPr>
+        <w:t>Ahn</w:t>
+      </w:r>
+      <w:proofErr w:type="spellEnd"/>
+      <w:r>
+        <w:rPr>
+          <w:rFonts w:ascii="Calibri Light" w:hAnsi="Calibri Light" w:cs="Calibri Light"/>
+          <w:sz w:val="22"/>
+          <w:lang w:eastAsia="ko-KR"/>
+        </w:rPr>
+        <w:t>, W.</w:t>
+      </w:r>
+      <w:r>
+        <w:rPr>
+          <w:rFonts w:ascii="Calibri Light" w:hAnsi="Calibri Light" w:cs="Calibri Light"/>
+          <w:sz w:val="22"/>
+          <w:lang w:eastAsia="ko-KR"/>
+        </w:rPr>
+        <w:t>-Y.</w:t>
+      </w:r>
+      <w:r>
+        <w:rPr>
+          <w:rFonts w:ascii="Calibri Light" w:hAnsi="Calibri Light" w:cs="Calibri Light"/>
           <w:sz w:val="22"/>
           <w:vertAlign w:val="superscript"/>
           <w:lang w:eastAsia="ko-KR"/>
         </w:rPr>
-        <w:t>*</w:t>
+        <w:t xml:space="preserve"> </w:t>
+      </w:r>
+      <w:r>
+        <w:rPr>
+          <w:rFonts w:ascii="Calibri Light" w:hAnsi="Calibri Light" w:cs="Calibri Light"/>
+          <w:sz w:val="22"/>
+          <w:lang w:eastAsia="ko-KR"/>
+        </w:rPr>
+        <w:t>(</w:t>
+      </w:r>
+      <w:r>
+        <w:rPr>
+          <w:rFonts w:ascii="Calibri Light" w:hAnsi="Calibri Light" w:cs="Calibri Light"/>
+          <w:sz w:val="22"/>
+          <w:lang w:eastAsia="ko-KR"/>
+        </w:rPr>
+        <w:t>2023</w:t>
+      </w:r>
+      <w:r>
+        <w:rPr>
+          <w:rFonts w:ascii="Calibri Light" w:hAnsi="Calibri Light" w:cs="Calibri Light"/>
+          <w:sz w:val="22"/>
+          <w:lang w:eastAsia="ko-KR"/>
+        </w:rPr>
+        <w:t xml:space="preserve">) </w:t>
+      </w:r>
+      <w:r>
+        <w:rPr>
+          <w:rFonts w:ascii="Calibri Light" w:hAnsi="Calibri Light" w:cs="Calibri Light"/>
+          <w:sz w:val="22"/>
+          <w:lang w:eastAsia="ko-KR"/>
+        </w:rPr>
+        <w:t>Multi-model prediction of successful smoking cessation: Insights from neural, computational, and ecological momentary assessments data</w:t>
       </w:r>
       <w:r>
         <w:rPr>
@@ -1841,91 +1979,18 @@
       <w:r>
         <w:rPr>
           <w:rFonts w:ascii="Calibri Light" w:hAnsi="Calibri Light" w:cs="Calibri Light"/>
-          <w:sz w:val="22"/>
-          <w:lang w:eastAsia="ko-KR"/>
-        </w:rPr>
-        <w:t>Choi, H</w:t>
-      </w:r>
-      <w:r>
-        <w:rPr>
-          <w:rFonts w:ascii="Calibri Light" w:hAnsi="Calibri Light" w:cs="Calibri Light"/>
-          <w:sz w:val="22"/>
-          <w:lang w:eastAsia="ko-KR"/>
-        </w:rPr>
-        <w:t>.</w:t>
-      </w:r>
-      <w:r>
-        <w:rPr>
-          <w:rFonts w:ascii="Calibri Light" w:hAnsi="Calibri Light" w:cs="Calibri Light"/>
-          <w:sz w:val="22"/>
-          <w:vertAlign w:val="superscript"/>
-          <w:lang w:eastAsia="ko-KR"/>
-        </w:rPr>
-        <w:t>*</w:t>
-      </w:r>
-      <w:r>
-        <w:rPr>
-          <w:rFonts w:ascii="Calibri Light" w:hAnsi="Calibri Light" w:cs="Calibri Light"/>
-          <w:sz w:val="22"/>
-          <w:lang w:eastAsia="ko-KR"/>
-        </w:rPr>
-        <w:t>, P</w:t>
-      </w:r>
-      <w:r>
-        <w:rPr>
-          <w:rFonts w:ascii="Calibri Light" w:hAnsi="Calibri Light" w:cs="Calibri Light"/>
-          <w:sz w:val="22"/>
-          <w:lang w:eastAsia="ko-KR"/>
-        </w:rPr>
-        <w:t xml:space="preserve">ark, H., </w:t>
-      </w:r>
-      <w:proofErr w:type="spellStart"/>
-      <w:r>
-        <w:rPr>
-          <w:rFonts w:ascii="Calibri Light" w:hAnsi="Calibri Light" w:cs="Calibri Light"/>
-          <w:sz w:val="22"/>
-          <w:lang w:eastAsia="ko-KR"/>
-        </w:rPr>
-        <w:t>Ahn</w:t>
-      </w:r>
-      <w:proofErr w:type="spellEnd"/>
-      <w:r>
-        <w:rPr>
-          <w:rFonts w:ascii="Calibri Light" w:hAnsi="Calibri Light" w:cs="Calibri Light"/>
-          <w:sz w:val="22"/>
-          <w:lang w:eastAsia="ko-KR"/>
-        </w:rPr>
-        <w:t>, W.</w:t>
-      </w:r>
-      <w:r>
-        <w:rPr>
-          <w:rFonts w:ascii="Calibri Light" w:hAnsi="Calibri Light" w:cs="Calibri Light"/>
-          <w:sz w:val="22"/>
-          <w:vertAlign w:val="superscript"/>
-          <w:lang w:eastAsia="ko-KR"/>
-        </w:rPr>
-        <w:t>+</w:t>
-      </w:r>
-      <w:r>
-        <w:rPr>
-          <w:rFonts w:ascii="Calibri Light" w:hAnsi="Calibri Light" w:cs="Calibri Light"/>
-          <w:sz w:val="22"/>
-          <w:lang w:eastAsia="ko-KR"/>
-        </w:rPr>
-        <w:t>, Jung Y.</w:t>
-      </w:r>
-      <w:r>
-        <w:rPr>
-          <w:rFonts w:ascii="Calibri Light" w:hAnsi="Calibri Light" w:cs="Calibri Light"/>
-          <w:sz w:val="22"/>
-          <w:vertAlign w:val="superscript"/>
-          <w:lang w:eastAsia="ko-KR"/>
-        </w:rPr>
-        <w:t>+</w:t>
-      </w:r>
-      <w:r>
-        <w:rPr>
-          <w:rFonts w:ascii="Calibri Light" w:hAnsi="Calibri Light" w:cs="Calibri Light"/>
+          <w:i/>
+          <w:iCs/>
+          <w:sz w:val="22"/>
+          <w:lang w:eastAsia="ko-KR"/>
+        </w:rPr>
+        <w:t>presented</w:t>
+      </w:r>
+      <w:r>
+        <w:rPr>
+          <w:rFonts w:ascii="Calibri Light" w:hAnsi="Calibri Light" w:cs="Calibri Light"/>
+          <w:i/>
+          <w:iCs/>
           <w:sz w:val="22"/>
           <w:lang w:eastAsia="ko-KR"/>
         </w:rPr>
@@ -1934,58 +1999,6 @@
       <w:r>
         <w:rPr>
           <w:rFonts w:ascii="Calibri Light" w:hAnsi="Calibri Light" w:cs="Calibri Light"/>
-          <w:sz w:val="22"/>
-          <w:lang w:eastAsia="ko-KR"/>
-        </w:rPr>
-        <w:t>(</w:t>
-      </w:r>
-      <w:r>
-        <w:rPr>
-          <w:rFonts w:ascii="Calibri Light" w:hAnsi="Calibri Light" w:cs="Calibri Light"/>
-          <w:sz w:val="22"/>
-          <w:lang w:eastAsia="ko-KR"/>
-        </w:rPr>
-        <w:t>2023</w:t>
-      </w:r>
-      <w:r>
-        <w:rPr>
-          <w:rFonts w:ascii="Calibri Light" w:hAnsi="Calibri Light" w:cs="Calibri Light"/>
-          <w:sz w:val="22"/>
-          <w:lang w:eastAsia="ko-KR"/>
-        </w:rPr>
-        <w:t xml:space="preserve">) </w:t>
-      </w:r>
-      <w:r>
-        <w:rPr>
-          <w:rFonts w:ascii="Calibri Light" w:hAnsi="Calibri Light" w:cs="Calibri Light"/>
-          <w:sz w:val="22"/>
-          <w:lang w:eastAsia="ko-KR"/>
-        </w:rPr>
-        <w:t xml:space="preserve">Neural correlates of goal-directed control in internet gaming disorder and alcohol use disorder, </w:t>
-      </w:r>
-      <w:r>
-        <w:rPr>
-          <w:rFonts w:ascii="Calibri Light" w:hAnsi="Calibri Light" w:cs="Calibri Light"/>
-          <w:i/>
-          <w:iCs/>
-          <w:sz w:val="22"/>
-          <w:lang w:eastAsia="ko-KR"/>
-        </w:rPr>
-        <w:t>presented</w:t>
-      </w:r>
-      <w:r>
-        <w:rPr>
-          <w:rFonts w:ascii="Calibri Light" w:hAnsi="Calibri Light" w:cs="Calibri Light"/>
-          <w:i/>
-          <w:iCs/>
-          <w:sz w:val="22"/>
-          <w:lang w:eastAsia="ko-KR"/>
-        </w:rPr>
-        <w:t xml:space="preserve"> </w:t>
-      </w:r>
-      <w:r>
-        <w:rPr>
-          <w:rFonts w:ascii="Calibri Light" w:hAnsi="Calibri Light" w:cs="Calibri Light"/>
           <w:i/>
           <w:iCs/>
           <w:sz w:val="22"/>
@@ -2001,21 +2014,34 @@
           <w:sz w:val="22"/>
           <w:lang w:eastAsia="ko-KR"/>
         </w:rPr>
-        <w:t>8th International Conference on Behavioral Addictions, Incheon, Korea</w:t>
-      </w:r>
-      <w:r>
-        <w:rPr>
-          <w:rFonts w:ascii="Calibri Light" w:hAnsi="Calibri Light" w:cs="Calibri Light"/>
-          <w:i/>
-          <w:iCs/>
-          <w:sz w:val="22"/>
-          <w:lang w:eastAsia="ko-KR"/>
-        </w:rPr>
-        <w:t>.</w:t>
-      </w:r>
-    </w:p>
-    <w:p>
-      <w:pPr>
+        <w:t>Society for Neuroscience</w:t>
+      </w:r>
+      <w:r>
+        <w:rPr>
+          <w:rFonts w:ascii="Calibri Light" w:hAnsi="Calibri Light" w:cs="Calibri Light"/>
+          <w:i/>
+          <w:iCs/>
+          <w:sz w:val="22"/>
+          <w:lang w:eastAsia="ko-KR"/>
+        </w:rPr>
+        <w:t xml:space="preserve">, </w:t>
+      </w:r>
+      <w:r>
+        <w:rPr>
+          <w:rFonts w:ascii="Calibri Light" w:hAnsi="Calibri Light" w:cs="Calibri Light"/>
+          <w:i/>
+          <w:iCs/>
+          <w:sz w:val="22"/>
+          <w:lang w:eastAsia="ko-KR"/>
+        </w:rPr>
+        <w:t>Washington, D.C.</w:t>
+      </w:r>
+    </w:p>
+    <w:p>
+      <w:pPr>
+        <w:tabs>
+          <w:tab w:val="right" w:pos="8640"/>
+        </w:tabs>
         <w:spacing w:after="80"/>
         <w:ind w:left="567" w:hanging="567"/>
         <w:rPr>
@@ -2032,23 +2058,67 @@
           <w:sz w:val="22"/>
           <w:lang w:eastAsia="ko-KR"/>
         </w:rPr>
-        <w:t>Kwon, M.,</w:t>
-      </w:r>
-      <w:r>
-        <w:rPr>
-          <w:rFonts w:ascii="Calibri Light" w:hAnsi="Calibri Light" w:cs="Calibri Light"/>
-          <w:sz w:val="22"/>
-          <w:lang w:eastAsia="ko-KR"/>
-        </w:rPr>
-        <w:t xml:space="preserve"> Kim, H., Yang, J., </w:t>
-      </w:r>
-      <w:r>
-        <w:rPr>
-          <w:rFonts w:ascii="Calibri Light" w:hAnsi="Calibri Light" w:cs="Calibri Light"/>
-          <w:sz w:val="22"/>
-          <w:lang w:eastAsia="ko-KR"/>
-        </w:rPr>
-        <w:t xml:space="preserve">Lee, Y., </w:t>
+        <w:t>Kwon, M.</w:t>
+      </w:r>
+      <w:r>
+        <w:rPr>
+          <w:rFonts w:ascii="Calibri Light" w:hAnsi="Calibri Light" w:cs="Calibri Light"/>
+          <w:b/>
+          <w:bCs/>
+          <w:sz w:val="22"/>
+          <w:vertAlign w:val="superscript"/>
+          <w:lang w:eastAsia="ko-KR"/>
+        </w:rPr>
+        <w:t>*</w:t>
+      </w:r>
+      <w:r>
+        <w:rPr>
+          <w:rFonts w:ascii="Calibri Light" w:hAnsi="Calibri Light" w:cs="Calibri Light"/>
+          <w:sz w:val="22"/>
+          <w:lang w:eastAsia="ko-KR"/>
+        </w:rPr>
+        <w:t xml:space="preserve">, </w:t>
+      </w:r>
+      <w:r>
+        <w:rPr>
+          <w:rFonts w:ascii="Calibri Light" w:hAnsi="Calibri Light" w:cs="Calibri Light"/>
+          <w:sz w:val="22"/>
+          <w:lang w:eastAsia="ko-KR"/>
+        </w:rPr>
+        <w:t>Choi, H</w:t>
+      </w:r>
+      <w:r>
+        <w:rPr>
+          <w:rFonts w:ascii="Calibri Light" w:hAnsi="Calibri Light" w:cs="Calibri Light"/>
+          <w:sz w:val="22"/>
+          <w:lang w:eastAsia="ko-KR"/>
+        </w:rPr>
+        <w:t>.</w:t>
+      </w:r>
+      <w:r>
+        <w:rPr>
+          <w:rFonts w:ascii="Calibri Light" w:hAnsi="Calibri Light" w:cs="Calibri Light"/>
+          <w:sz w:val="22"/>
+          <w:vertAlign w:val="superscript"/>
+          <w:lang w:eastAsia="ko-KR"/>
+        </w:rPr>
+        <w:t>*</w:t>
+      </w:r>
+      <w:r>
+        <w:rPr>
+          <w:rFonts w:ascii="Calibri Light" w:hAnsi="Calibri Light" w:cs="Calibri Light"/>
+          <w:sz w:val="22"/>
+          <w:lang w:eastAsia="ko-KR"/>
+        </w:rPr>
+        <w:t>, P</w:t>
+      </w:r>
+      <w:r>
+        <w:rPr>
+          <w:rFonts w:ascii="Calibri Light" w:hAnsi="Calibri Light" w:cs="Calibri Light"/>
+          <w:sz w:val="22"/>
+          <w:lang w:eastAsia="ko-KR"/>
+        </w:rPr>
+        <w:t xml:space="preserve">ark, H., </w:t>
       </w:r>
       <w:proofErr w:type="spellStart"/>
       <w:r>
@@ -2057,7 +2127,7 @@
           <w:sz w:val="22"/>
           <w:lang w:eastAsia="ko-KR"/>
         </w:rPr>
-        <w:t>Hur</w:t>
+        <w:t>Ahn</w:t>
       </w:r>
       <w:proofErr w:type="spellEnd"/>
       <w:r>
@@ -2066,66 +2136,143 @@
           <w:sz w:val="22"/>
           <w:lang w:eastAsia="ko-KR"/>
         </w:rPr>
-        <w:t xml:space="preserve">, J., Lee, T.-H., &amp; </w:t>
-      </w:r>
-      <w:proofErr w:type="spellStart"/>
-      <w:r>
-        <w:rPr>
-          <w:rFonts w:ascii="Calibri Light" w:hAnsi="Calibri Light" w:cs="Calibri Light"/>
-          <w:sz w:val="22"/>
-          <w:lang w:eastAsia="ko-KR"/>
-        </w:rPr>
-        <w:t>Ahn</w:t>
-      </w:r>
-      <w:proofErr w:type="spellEnd"/>
-      <w:r>
-        <w:rPr>
-          <w:rFonts w:ascii="Calibri Light" w:hAnsi="Calibri Light" w:cs="Calibri Light"/>
-          <w:sz w:val="22"/>
-          <w:lang w:eastAsia="ko-KR"/>
-        </w:rPr>
-        <w:t xml:space="preserve">, W.-Y. </w:t>
-      </w:r>
-      <w:r>
-        <w:rPr>
-          <w:rFonts w:ascii="Calibri Light" w:hAnsi="Calibri Light" w:cs="Calibri Light"/>
-          <w:sz w:val="22"/>
-          <w:lang w:eastAsia="ko-KR"/>
-        </w:rPr>
-        <w:t xml:space="preserve">(2023) </w:t>
-      </w:r>
-      <w:r>
-        <w:rPr>
-          <w:rFonts w:ascii="Calibri Light" w:hAnsi="Calibri Light" w:cs="Calibri Light"/>
-          <w:sz w:val="22"/>
-          <w:lang w:eastAsia="ko-KR"/>
-        </w:rPr>
-        <w:t>Caffeinated soda intake in children is associated with neurobehavioral risk factors for substance misuse</w:t>
-      </w:r>
-      <w:r>
-        <w:rPr>
-          <w:rFonts w:ascii="Calibri Light" w:hAnsi="Calibri Light" w:cs="Calibri Light"/>
-          <w:sz w:val="22"/>
-          <w:lang w:eastAsia="ko-KR"/>
-        </w:rPr>
-        <w:t xml:space="preserve">, </w:t>
-      </w:r>
-      <w:r>
-        <w:rPr>
-          <w:rFonts w:ascii="Calibri Light" w:hAnsi="Calibri Light" w:cs="Calibri Light"/>
-          <w:i/>
-          <w:iCs/>
-          <w:sz w:val="22"/>
-          <w:lang w:eastAsia="ko-KR"/>
-        </w:rPr>
-        <w:t>presented at 2023 Annual Conference of the Korean Psychological Association, Suwon, Korea.</w:t>
-      </w:r>
-    </w:p>
-    <w:p>
-      <w:pPr>
-        <w:tabs>
-          <w:tab w:val="right" w:pos="8640"/>
-        </w:tabs>
+        <w:t>, W</w:t>
+      </w:r>
+      <w:r>
+        <w:rPr>
+          <w:rFonts w:ascii="Calibri Light" w:hAnsi="Calibri Light" w:cs="Calibri Light"/>
+          <w:sz w:val="22"/>
+          <w:lang w:eastAsia="ko-KR"/>
+        </w:rPr>
+        <w:t>.-Y</w:t>
+      </w:r>
+      <w:r>
+        <w:rPr>
+          <w:rFonts w:ascii="Calibri Light" w:hAnsi="Calibri Light" w:cs="Calibri Light"/>
+          <w:sz w:val="22"/>
+          <w:lang w:eastAsia="ko-KR"/>
+        </w:rPr>
+        <w:t>.</w:t>
+      </w:r>
+      <w:r>
+        <w:rPr>
+          <w:rFonts w:ascii="Calibri Light" w:hAnsi="Calibri Light" w:cs="Calibri Light"/>
+          <w:sz w:val="22"/>
+          <w:vertAlign w:val="superscript"/>
+          <w:lang w:eastAsia="ko-KR"/>
+        </w:rPr>
+        <w:t>+</w:t>
+      </w:r>
+      <w:r>
+        <w:rPr>
+          <w:rFonts w:ascii="Calibri Light" w:hAnsi="Calibri Light" w:cs="Calibri Light"/>
+          <w:sz w:val="22"/>
+          <w:lang w:eastAsia="ko-KR"/>
+        </w:rPr>
+        <w:t>, Jung Y.</w:t>
+      </w:r>
+      <w:r>
+        <w:rPr>
+          <w:rFonts w:ascii="Calibri Light" w:hAnsi="Calibri Light" w:cs="Calibri Light"/>
+          <w:sz w:val="22"/>
+          <w:vertAlign w:val="superscript"/>
+          <w:lang w:eastAsia="ko-KR"/>
+        </w:rPr>
+        <w:t>+</w:t>
+      </w:r>
+      <w:r>
+        <w:rPr>
+          <w:rFonts w:ascii="Calibri Light" w:hAnsi="Calibri Light" w:cs="Calibri Light"/>
+          <w:sz w:val="22"/>
+          <w:lang w:eastAsia="ko-KR"/>
+        </w:rPr>
+        <w:t xml:space="preserve"> </w:t>
+      </w:r>
+      <w:r>
+        <w:rPr>
+          <w:rFonts w:ascii="Calibri Light" w:hAnsi="Calibri Light" w:cs="Calibri Light"/>
+          <w:sz w:val="22"/>
+          <w:lang w:eastAsia="ko-KR"/>
+        </w:rPr>
+        <w:t>(</w:t>
+      </w:r>
+      <w:r>
+        <w:rPr>
+          <w:rFonts w:ascii="Calibri Light" w:hAnsi="Calibri Light" w:cs="Calibri Light"/>
+          <w:sz w:val="22"/>
+          <w:lang w:eastAsia="ko-KR"/>
+        </w:rPr>
+        <w:t>2023</w:t>
+      </w:r>
+      <w:r>
+        <w:rPr>
+          <w:rFonts w:ascii="Calibri Light" w:hAnsi="Calibri Light" w:cs="Calibri Light"/>
+          <w:sz w:val="22"/>
+          <w:lang w:eastAsia="ko-KR"/>
+        </w:rPr>
+        <w:t xml:space="preserve">) </w:t>
+      </w:r>
+      <w:r>
+        <w:rPr>
+          <w:rFonts w:ascii="Calibri Light" w:hAnsi="Calibri Light" w:cs="Calibri Light"/>
+          <w:sz w:val="22"/>
+          <w:lang w:eastAsia="ko-KR"/>
+        </w:rPr>
+        <w:t xml:space="preserve">Neural correlates of goal-directed control in internet gaming disorder and alcohol use disorder, </w:t>
+      </w:r>
+      <w:r>
+        <w:rPr>
+          <w:rFonts w:ascii="Calibri Light" w:hAnsi="Calibri Light" w:cs="Calibri Light"/>
+          <w:i/>
+          <w:iCs/>
+          <w:sz w:val="22"/>
+          <w:lang w:eastAsia="ko-KR"/>
+        </w:rPr>
+        <w:t>presented</w:t>
+      </w:r>
+      <w:r>
+        <w:rPr>
+          <w:rFonts w:ascii="Calibri Light" w:hAnsi="Calibri Light" w:cs="Calibri Light"/>
+          <w:i/>
+          <w:iCs/>
+          <w:sz w:val="22"/>
+          <w:lang w:eastAsia="ko-KR"/>
+        </w:rPr>
+        <w:t xml:space="preserve"> </w:t>
+      </w:r>
+      <w:r>
+        <w:rPr>
+          <w:rFonts w:ascii="Calibri Light" w:hAnsi="Calibri Light" w:cs="Calibri Light"/>
+          <w:i/>
+          <w:iCs/>
+          <w:sz w:val="22"/>
+          <w:lang w:eastAsia="ko-KR"/>
+        </w:rPr>
+        <w:t xml:space="preserve">at </w:t>
+      </w:r>
+      <w:r>
+        <w:rPr>
+          <w:rFonts w:ascii="Calibri Light" w:hAnsi="Calibri Light" w:cs="Calibri Light"/>
+          <w:i/>
+          <w:iCs/>
+          <w:sz w:val="22"/>
+          <w:lang w:eastAsia="ko-KR"/>
+        </w:rPr>
+        <w:t>8th International Conference on Behavioral Addictions, Incheon, Korea</w:t>
+      </w:r>
+      <w:r>
+        <w:rPr>
+          <w:rFonts w:ascii="Calibri Light" w:hAnsi="Calibri Light" w:cs="Calibri Light"/>
+          <w:i/>
+          <w:iCs/>
+          <w:sz w:val="22"/>
+          <w:lang w:eastAsia="ko-KR"/>
+        </w:rPr>
+        <w:t>.</w:t>
+      </w:r>
+    </w:p>
+    <w:p>
+      <w:pPr>
         <w:spacing w:after="80"/>
         <w:ind w:left="567" w:hanging="567"/>
         <w:rPr>
@@ -2142,6 +2289,116 @@
           <w:sz w:val="22"/>
           <w:lang w:eastAsia="ko-KR"/>
         </w:rPr>
+        <w:t>Kwon, M.,</w:t>
+      </w:r>
+      <w:r>
+        <w:rPr>
+          <w:rFonts w:ascii="Calibri Light" w:hAnsi="Calibri Light" w:cs="Calibri Light"/>
+          <w:sz w:val="22"/>
+          <w:lang w:eastAsia="ko-KR"/>
+        </w:rPr>
+        <w:t xml:space="preserve"> Kim, H., Yang, J., </w:t>
+      </w:r>
+      <w:r>
+        <w:rPr>
+          <w:rFonts w:ascii="Calibri Light" w:hAnsi="Calibri Light" w:cs="Calibri Light"/>
+          <w:sz w:val="22"/>
+          <w:lang w:eastAsia="ko-KR"/>
+        </w:rPr>
+        <w:t xml:space="preserve">Lee, Y., </w:t>
+      </w:r>
+      <w:proofErr w:type="spellStart"/>
+      <w:r>
+        <w:rPr>
+          <w:rFonts w:ascii="Calibri Light" w:hAnsi="Calibri Light" w:cs="Calibri Light"/>
+          <w:sz w:val="22"/>
+          <w:lang w:eastAsia="ko-KR"/>
+        </w:rPr>
+        <w:t>Hur</w:t>
+      </w:r>
+      <w:proofErr w:type="spellEnd"/>
+      <w:r>
+        <w:rPr>
+          <w:rFonts w:ascii="Calibri Light" w:hAnsi="Calibri Light" w:cs="Calibri Light"/>
+          <w:sz w:val="22"/>
+          <w:lang w:eastAsia="ko-KR"/>
+        </w:rPr>
+        <w:t xml:space="preserve">, J., Lee, T.-H., &amp; </w:t>
+      </w:r>
+      <w:proofErr w:type="spellStart"/>
+      <w:r>
+        <w:rPr>
+          <w:rFonts w:ascii="Calibri Light" w:hAnsi="Calibri Light" w:cs="Calibri Light"/>
+          <w:sz w:val="22"/>
+          <w:lang w:eastAsia="ko-KR"/>
+        </w:rPr>
+        <w:t>Ahn</w:t>
+      </w:r>
+      <w:proofErr w:type="spellEnd"/>
+      <w:r>
+        <w:rPr>
+          <w:rFonts w:ascii="Calibri Light" w:hAnsi="Calibri Light" w:cs="Calibri Light"/>
+          <w:sz w:val="22"/>
+          <w:lang w:eastAsia="ko-KR"/>
+        </w:rPr>
+        <w:t xml:space="preserve">, W.-Y. </w:t>
+      </w:r>
+      <w:r>
+        <w:rPr>
+          <w:rFonts w:ascii="Calibri Light" w:hAnsi="Calibri Light" w:cs="Calibri Light"/>
+          <w:sz w:val="22"/>
+          <w:lang w:eastAsia="ko-KR"/>
+        </w:rPr>
+        <w:t xml:space="preserve">(2023) </w:t>
+      </w:r>
+      <w:r>
+        <w:rPr>
+          <w:rFonts w:ascii="Calibri Light" w:hAnsi="Calibri Light" w:cs="Calibri Light"/>
+          <w:sz w:val="22"/>
+          <w:lang w:eastAsia="ko-KR"/>
+        </w:rPr>
+        <w:t>Caffeinated soda intake in children is associated with neurobehavioral risk factors for substance misuse</w:t>
+      </w:r>
+      <w:r>
+        <w:rPr>
+          <w:rFonts w:ascii="Calibri Light" w:hAnsi="Calibri Light" w:cs="Calibri Light"/>
+          <w:sz w:val="22"/>
+          <w:lang w:eastAsia="ko-KR"/>
+        </w:rPr>
+        <w:t xml:space="preserve">, </w:t>
+      </w:r>
+      <w:r>
+        <w:rPr>
+          <w:rFonts w:ascii="Calibri Light" w:hAnsi="Calibri Light" w:cs="Calibri Light"/>
+          <w:i/>
+          <w:iCs/>
+          <w:sz w:val="22"/>
+          <w:lang w:eastAsia="ko-KR"/>
+        </w:rPr>
+        <w:t>presented at 2023 Annual Conference of the Korean Psychological Association, Suwon, Korea.</w:t>
+      </w:r>
+    </w:p>
+    <w:p>
+      <w:pPr>
+        <w:tabs>
+          <w:tab w:val="right" w:pos="8640"/>
+        </w:tabs>
+        <w:spacing w:after="80"/>
+        <w:ind w:left="567" w:hanging="567"/>
+        <w:rPr>
+          <w:rFonts w:ascii="Calibri Light" w:hAnsi="Calibri Light" w:cs="Calibri Light"/>
+          <w:sz w:val="22"/>
+          <w:lang w:eastAsia="ko-KR"/>
+        </w:rPr>
+      </w:pPr>
+      <w:r>
+        <w:rPr>
+          <w:rFonts w:ascii="Calibri Light" w:hAnsi="Calibri Light" w:cs="Calibri Light"/>
+          <w:b/>
+          <w:bCs/>
+          <w:sz w:val="22"/>
+          <w:lang w:eastAsia="ko-KR"/>
+        </w:rPr>
         <w:t>Kwon, M.</w:t>
       </w:r>
       <w:r>
@@ -2220,7 +2477,39 @@
           <w:sz w:val="22"/>
           <w:lang w:eastAsia="ko-KR"/>
         </w:rPr>
-        <w:t>, W.</w:t>
+        <w:t>, W</w:t>
+      </w:r>
+      <w:r>
+        <w:rPr>
+          <w:rFonts w:ascii="Calibri Light" w:hAnsi="Calibri Light" w:cs="Calibri Light"/>
+          <w:sz w:val="22"/>
+          <w:lang w:eastAsia="ko-KR"/>
+        </w:rPr>
+        <w:t>.</w:t>
+      </w:r>
+      <w:r>
+        <w:rPr>
+          <w:rFonts w:ascii="Calibri Light" w:hAnsi="Calibri Light" w:cs="Calibri Light"/>
+          <w:sz w:val="22"/>
+          <w:lang w:eastAsia="ko-KR"/>
+        </w:rPr>
+        <w:t>-</w:t>
+      </w:r>
+      <w:r>
+        <w:rPr>
+          <w:rFonts w:ascii="Calibri Light" w:hAnsi="Calibri Light" w:cs="Calibri Light"/>
+          <w:sz w:val="22"/>
+          <w:lang w:eastAsia="ko-KR"/>
+        </w:rPr>
+        <w:t>Y</w:t>
+      </w:r>
+      <w:r>
+        <w:rPr>
+          <w:rFonts w:ascii="Calibri Light" w:hAnsi="Calibri Light" w:cs="Calibri Light"/>
+          <w:sz w:val="22"/>
+          <w:lang w:eastAsia="ko-KR"/>
+        </w:rPr>
+        <w:t>.</w:t>
       </w:r>
       <w:r>
         <w:rPr>
@@ -2451,7 +2740,23 @@
           <w:sz w:val="22"/>
           <w:lang w:eastAsia="ko-KR"/>
         </w:rPr>
-        <w:t>, W. (</w:t>
+        <w:t xml:space="preserve">, </w:t>
+      </w:r>
+      <w:r>
+        <w:rPr>
+          <w:rFonts w:ascii="Calibri Light" w:hAnsi="Calibri Light" w:cs="Calibri Light"/>
+          <w:sz w:val="22"/>
+          <w:lang w:eastAsia="ko-KR"/>
+        </w:rPr>
+        <w:t>W.-Y.</w:t>
+      </w:r>
+      <w:r>
+        <w:rPr>
+          <w:rFonts w:ascii="Calibri Light" w:hAnsi="Calibri Light" w:cs="Calibri Light"/>
+          <w:sz w:val="22"/>
+          <w:lang w:eastAsia="ko-KR"/>
+        </w:rPr>
+        <w:t xml:space="preserve"> (</w:t>
       </w:r>
       <w:r>
         <w:rPr>
@@ -2622,7 +2927,23 @@
           <w:sz w:val="22"/>
           <w:lang w:eastAsia="ko-KR"/>
         </w:rPr>
-        <w:t>, W. (</w:t>
+        <w:t xml:space="preserve">, </w:t>
+      </w:r>
+      <w:r>
+        <w:rPr>
+          <w:rFonts w:ascii="Calibri Light" w:hAnsi="Calibri Light" w:cs="Calibri Light"/>
+          <w:sz w:val="22"/>
+          <w:lang w:eastAsia="ko-KR"/>
+        </w:rPr>
+        <w:t>W.-Y.</w:t>
+      </w:r>
+      <w:r>
+        <w:rPr>
+          <w:rFonts w:ascii="Calibri Light" w:hAnsi="Calibri Light" w:cs="Calibri Light"/>
+          <w:sz w:val="22"/>
+          <w:lang w:eastAsia="ko-KR"/>
+        </w:rPr>
+        <w:t xml:space="preserve"> (</w:t>
       </w:r>
       <w:r>
         <w:rPr>
@@ -2841,7 +3162,23 @@
           <w:sz w:val="22"/>
           <w:lang w:eastAsia="ko-KR"/>
         </w:rPr>
-        <w:t>, W. (202</w:t>
+        <w:t xml:space="preserve">, </w:t>
+      </w:r>
+      <w:r>
+        <w:rPr>
+          <w:rFonts w:ascii="Calibri Light" w:hAnsi="Calibri Light" w:cs="Calibri Light"/>
+          <w:sz w:val="22"/>
+          <w:lang w:eastAsia="ko-KR"/>
+        </w:rPr>
+        <w:t>W.-Y.</w:t>
+      </w:r>
+      <w:r>
+        <w:rPr>
+          <w:rFonts w:ascii="Calibri Light" w:hAnsi="Calibri Light" w:cs="Calibri Light"/>
+          <w:sz w:val="22"/>
+          <w:lang w:eastAsia="ko-KR"/>
+        </w:rPr>
+        <w:t xml:space="preserve"> (202</w:t>
       </w:r>
       <w:r>
         <w:rPr>
@@ -3001,7 +3338,39 @@
           <w:sz w:val="22"/>
           <w:lang w:eastAsia="ko-KR"/>
         </w:rPr>
-        <w:t xml:space="preserve">, W., &amp; Jung, Y. (2020) Neural Correlates of Goal-Directed Control in Interest Gaming Disorder and Alcohol Use Disorder, </w:t>
+        <w:t xml:space="preserve">, </w:t>
+      </w:r>
+      <w:r>
+        <w:rPr>
+          <w:rFonts w:ascii="Calibri Light" w:hAnsi="Calibri Light" w:cs="Calibri Light"/>
+          <w:sz w:val="22"/>
+          <w:lang w:eastAsia="ko-KR"/>
+        </w:rPr>
+        <w:t>W.-Y.</w:t>
+      </w:r>
+      <w:r>
+        <w:rPr>
+          <w:rFonts w:ascii="Calibri Light" w:hAnsi="Calibri Light" w:cs="Calibri Light"/>
+          <w:sz w:val="22"/>
+          <w:lang w:eastAsia="ko-KR"/>
+        </w:rPr>
+        <w:t xml:space="preserve">, &amp; Jung, </w:t>
+      </w:r>
+      <w:r>
+        <w:rPr>
+          <w:rFonts w:ascii="Calibri Light" w:hAnsi="Calibri Light" w:cs="Calibri Light"/>
+          <w:sz w:val="22"/>
+          <w:lang w:eastAsia="ko-KR"/>
+        </w:rPr>
+        <w:t>W.-Y.</w:t>
+      </w:r>
+      <w:r>
+        <w:rPr>
+          <w:rFonts w:ascii="Calibri Light" w:hAnsi="Calibri Light" w:cs="Calibri Light"/>
+          <w:sz w:val="22"/>
+          <w:lang w:eastAsia="ko-KR"/>
+        </w:rPr>
+        <w:t xml:space="preserve"> (2020) Neural Correlates of Goal-Directed Control in Interest Gaming Disorder and Alcohol Use Disorder, </w:t>
       </w:r>
       <w:r>
         <w:rPr>
@@ -3119,7 +3488,23 @@
           <w:sz w:val="22"/>
           <w:lang w:eastAsia="ko-KR"/>
         </w:rPr>
-        <w:t xml:space="preserve">, W. (2019) Identifying behavioral and neural predictors of caffeinated soda intake in childhood using a large database from the ABCD study, </w:t>
+        <w:t xml:space="preserve">, </w:t>
+      </w:r>
+      <w:r>
+        <w:rPr>
+          <w:rFonts w:ascii="Calibri Light" w:hAnsi="Calibri Light" w:cs="Calibri Light"/>
+          <w:sz w:val="22"/>
+          <w:lang w:eastAsia="ko-KR"/>
+        </w:rPr>
+        <w:t>W.-Y.</w:t>
+      </w:r>
+      <w:r>
+        <w:rPr>
+          <w:rFonts w:ascii="Calibri Light" w:hAnsi="Calibri Light" w:cs="Calibri Light"/>
+          <w:sz w:val="22"/>
+          <w:lang w:eastAsia="ko-KR"/>
+        </w:rPr>
+        <w:t xml:space="preserve"> (2019) Identifying behavioral and neural predictors of caffeinated soda intake in childhood using a large database from the ABCD study, </w:t>
       </w:r>
       <w:r>
         <w:rPr>
@@ -3223,7 +3608,23 @@
           <w:sz w:val="22"/>
           <w:lang w:eastAsia="ko-KR"/>
         </w:rPr>
-        <w:t xml:space="preserve">, W. (2019) Effects of early life stress and social resources on neurocognitive functions: A large-scale replication study, </w:t>
+        <w:t xml:space="preserve">, </w:t>
+      </w:r>
+      <w:r>
+        <w:rPr>
+          <w:rFonts w:ascii="Calibri Light" w:hAnsi="Calibri Light" w:cs="Calibri Light"/>
+          <w:sz w:val="22"/>
+          <w:lang w:eastAsia="ko-KR"/>
+        </w:rPr>
+        <w:t>W.-Y.</w:t>
+      </w:r>
+      <w:r>
+        <w:rPr>
+          <w:rFonts w:ascii="Calibri Light" w:hAnsi="Calibri Light" w:cs="Calibri Light"/>
+          <w:sz w:val="22"/>
+          <w:lang w:eastAsia="ko-KR"/>
+        </w:rPr>
+        <w:t xml:space="preserve"> (2019) Effects of early life stress and social resources on neurocognitive functions: A large-scale replication study, </w:t>
       </w:r>
       <w:r>
         <w:rPr>

</xml_diff>

<commit_message>
edit CV - CAB
</commit_message>
<xml_diff>
--- a/files/CV_minakwon.docx
+++ b/files/CV_minakwon.docx
@@ -335,6 +335,289 @@
           <w:sz w:val="22"/>
           <w:szCs w:val="22"/>
         </w:rPr>
+        <w:t>University</w:t>
+      </w:r>
+      <w:r>
+        <w:rPr>
+          <w:rFonts w:ascii="Calibri Light" w:hAnsi="Calibri Light" w:cs="Calibri Light"/>
+          <w:b/>
+          <w:bCs/>
+          <w:sz w:val="22"/>
+          <w:szCs w:val="22"/>
+        </w:rPr>
+        <w:t xml:space="preserve"> of Chicago</w:t>
+      </w:r>
+      <w:r>
+        <w:rPr>
+          <w:rFonts w:ascii="Calibri Light" w:hAnsi="Calibri Light" w:cs="Calibri Light"/>
+          <w:sz w:val="22"/>
+          <w:szCs w:val="22"/>
+        </w:rPr>
+        <w:tab/>
+      </w:r>
+      <w:r>
+        <w:rPr>
+          <w:rFonts w:ascii="Calibri Light" w:hAnsi="Calibri Light" w:cs="Calibri Light"/>
+          <w:sz w:val="20"/>
+          <w:szCs w:val="20"/>
+        </w:rPr>
+        <w:t>Chicago</w:t>
+      </w:r>
+      <w:r>
+        <w:rPr>
+          <w:rFonts w:ascii="Calibri Light" w:hAnsi="Calibri Light" w:cs="Calibri Light"/>
+          <w:sz w:val="20"/>
+          <w:szCs w:val="20"/>
+        </w:rPr>
+        <w:t xml:space="preserve">, </w:t>
+      </w:r>
+      <w:r>
+        <w:rPr>
+          <w:rFonts w:ascii="Calibri Light" w:hAnsi="Calibri Light" w:cs="Calibri Light"/>
+          <w:sz w:val="20"/>
+          <w:szCs w:val="20"/>
+        </w:rPr>
+        <w:t>IL</w:t>
+      </w:r>
+    </w:p>
+    <w:p>
+      <w:pPr>
+        <w:tabs>
+          <w:tab w:val="left" w:pos="720"/>
+          <w:tab w:val="right" w:pos="8640"/>
+        </w:tabs>
+        <w:rPr>
+          <w:rFonts w:ascii="Calibri Light" w:hAnsi="Calibri Light" w:cs="Calibri Light"/>
+          <w:lang w:eastAsia="ko-KR"/>
+        </w:rPr>
+      </w:pPr>
+      <w:r>
+        <w:rPr>
+          <w:rFonts w:ascii="Calibri Light" w:hAnsi="Calibri Light" w:cs="Calibri Light"/>
+          <w:sz w:val="22"/>
+          <w:szCs w:val="22"/>
+        </w:rPr>
+        <w:t xml:space="preserve">Visiting </w:t>
+      </w:r>
+      <w:r>
+        <w:rPr>
+          <w:rFonts w:ascii="Calibri Light" w:hAnsi="Calibri Light" w:cs="Calibri Light"/>
+          <w:sz w:val="22"/>
+          <w:szCs w:val="22"/>
+        </w:rPr>
+        <w:t xml:space="preserve">Ph.D. </w:t>
+      </w:r>
+      <w:r>
+        <w:rPr>
+          <w:rFonts w:ascii="Calibri Light" w:hAnsi="Calibri Light" w:cs="Calibri Light"/>
+          <w:sz w:val="22"/>
+          <w:szCs w:val="22"/>
+        </w:rPr>
+        <w:t>Student</w:t>
+      </w:r>
+      <w:r>
+        <w:rPr>
+          <w:rFonts w:ascii="Calibri Light" w:hAnsi="Calibri Light" w:cs="Calibri Light"/>
+          <w:sz w:val="22"/>
+          <w:szCs w:val="22"/>
+        </w:rPr>
+        <w:t xml:space="preserve"> </w:t>
+      </w:r>
+      <w:r>
+        <w:rPr>
+          <w:rFonts w:ascii="Calibri Light" w:hAnsi="Calibri Light" w:cs="Calibri Light"/>
+        </w:rPr>
+        <w:tab/>
+      </w:r>
+      <w:r>
+        <w:rPr>
+          <w:rFonts w:ascii="Calibri Light" w:hAnsi="Calibri Light" w:cs="Calibri Light"/>
+          <w:i/>
+          <w:iCs/>
+          <w:sz w:val="20"/>
+          <w:szCs w:val="20"/>
+        </w:rPr>
+        <w:t>202</w:t>
+      </w:r>
+      <w:r>
+        <w:rPr>
+          <w:rFonts w:ascii="Calibri Light" w:hAnsi="Calibri Light" w:cs="Calibri Light"/>
+          <w:i/>
+          <w:iCs/>
+          <w:sz w:val="20"/>
+          <w:szCs w:val="20"/>
+        </w:rPr>
+        <w:t>4</w:t>
+      </w:r>
+      <w:r>
+        <w:rPr>
+          <w:rFonts w:ascii="Calibri Light" w:hAnsi="Calibri Light" w:cs="Calibri Light"/>
+          <w:i/>
+          <w:iCs/>
+          <w:sz w:val="20"/>
+          <w:szCs w:val="20"/>
+        </w:rPr>
+        <w:t>.0</w:t>
+      </w:r>
+      <w:r>
+        <w:rPr>
+          <w:rFonts w:ascii="Calibri Light" w:hAnsi="Calibri Light" w:cs="Calibri Light"/>
+          <w:i/>
+          <w:iCs/>
+          <w:sz w:val="20"/>
+          <w:szCs w:val="20"/>
+        </w:rPr>
+        <w:t>1</w:t>
+      </w:r>
+      <w:r>
+        <w:rPr>
+          <w:rFonts w:ascii="Calibri Light" w:hAnsi="Calibri Light" w:cs="Calibri Light"/>
+          <w:i/>
+          <w:iCs/>
+          <w:sz w:val="20"/>
+          <w:szCs w:val="20"/>
+        </w:rPr>
+        <w:t xml:space="preserve"> ~ </w:t>
+      </w:r>
+      <w:r>
+        <w:rPr>
+          <w:rFonts w:ascii="Calibri Light" w:hAnsi="Calibri Light" w:cs="Calibri Light"/>
+          <w:i/>
+          <w:iCs/>
+          <w:sz w:val="20"/>
+          <w:szCs w:val="20"/>
+          <w:lang w:eastAsia="ko-KR"/>
+        </w:rPr>
+        <w:t>present</w:t>
+      </w:r>
+    </w:p>
+    <w:p>
+      <w:pPr>
+        <w:tabs>
+          <w:tab w:val="left" w:pos="720"/>
+          <w:tab w:val="right" w:pos="8640"/>
+        </w:tabs>
+        <w:rPr>
+          <w:rFonts w:ascii="Calibri Light" w:hAnsi="Calibri Light" w:cs="Calibri Light"/>
+          <w:i/>
+          <w:iCs/>
+          <w:sz w:val="20"/>
+          <w:szCs w:val="20"/>
+        </w:rPr>
+      </w:pPr>
+      <w:r>
+        <w:rPr>
+          <w:rFonts w:ascii="Calibri Light" w:hAnsi="Calibri Light" w:cs="Calibri Light"/>
+          <w:i/>
+          <w:iCs/>
+          <w:sz w:val="20"/>
+          <w:szCs w:val="20"/>
+        </w:rPr>
+        <w:t xml:space="preserve">- Advisor: Professor </w:t>
+      </w:r>
+      <w:r>
+        <w:rPr>
+          <w:rFonts w:ascii="Calibri Light" w:hAnsi="Calibri Light" w:cs="Calibri Light"/>
+          <w:i/>
+          <w:iCs/>
+          <w:sz w:val="20"/>
+          <w:szCs w:val="20"/>
+        </w:rPr>
+        <w:t>Monica Rosenberg</w:t>
+      </w:r>
+    </w:p>
+    <w:p>
+      <w:pPr>
+        <w:tabs>
+          <w:tab w:val="left" w:pos="720"/>
+          <w:tab w:val="right" w:pos="8640"/>
+        </w:tabs>
+        <w:rPr>
+          <w:rFonts w:ascii="Calibri Light" w:hAnsi="Calibri Light" w:cs="Calibri Light"/>
+          <w:i/>
+          <w:iCs/>
+          <w:sz w:val="20"/>
+          <w:szCs w:val="20"/>
+        </w:rPr>
+      </w:pPr>
+      <w:r>
+        <w:rPr>
+          <w:rFonts w:ascii="Calibri Light" w:hAnsi="Calibri Light" w:cs="Calibri Light"/>
+          <w:i/>
+          <w:iCs/>
+          <w:sz w:val="20"/>
+          <w:szCs w:val="20"/>
+        </w:rPr>
+        <w:t>- Cognition, Attention, &amp; Brain Lab (</w:t>
+      </w:r>
+      <w:hyperlink r:id="rId10" w:history="1">
+        <w:r>
+          <w:rPr>
+            <w:rStyle w:val="Hyperlink"/>
+            <w:rFonts w:ascii="Calibri Light" w:hAnsi="Calibri Light" w:cs="Calibri Light"/>
+            <w:i/>
+            <w:iCs/>
+            <w:sz w:val="20"/>
+            <w:szCs w:val="20"/>
+          </w:rPr>
+          <w:t>CAB L</w:t>
+        </w:r>
+        <w:r>
+          <w:rPr>
+            <w:rStyle w:val="Hyperlink"/>
+            <w:rFonts w:ascii="Calibri Light" w:hAnsi="Calibri Light" w:cs="Calibri Light"/>
+            <w:i/>
+            <w:iCs/>
+            <w:sz w:val="20"/>
+            <w:szCs w:val="20"/>
+          </w:rPr>
+          <w:t>ab</w:t>
+        </w:r>
+      </w:hyperlink>
+      <w:r>
+        <w:rPr>
+          <w:rFonts w:ascii="Calibri Light" w:hAnsi="Calibri Light" w:cs="Calibri Light"/>
+          <w:i/>
+          <w:iCs/>
+          <w:sz w:val="20"/>
+          <w:szCs w:val="20"/>
+        </w:rPr>
+        <w:t>)</w:t>
+      </w:r>
+    </w:p>
+    <w:p>
+      <w:pPr>
+        <w:tabs>
+          <w:tab w:val="left" w:pos="720"/>
+          <w:tab w:val="right" w:pos="8640"/>
+        </w:tabs>
+        <w:rPr>
+          <w:rFonts w:ascii="Calibri Light" w:hAnsi="Calibri Light" w:cs="Calibri Light"/>
+          <w:b/>
+          <w:bCs/>
+          <w:sz w:val="22"/>
+          <w:szCs w:val="22"/>
+        </w:rPr>
+      </w:pPr>
+    </w:p>
+    <w:p>
+      <w:pPr>
+        <w:tabs>
+          <w:tab w:val="left" w:pos="720"/>
+          <w:tab w:val="right" w:pos="8640"/>
+        </w:tabs>
+        <w:rPr>
+          <w:rFonts w:ascii="Calibri Light" w:hAnsi="Calibri Light" w:cs="Calibri Light"/>
+        </w:rPr>
+      </w:pPr>
+      <w:r>
+        <w:rPr>
+          <w:rFonts w:ascii="Calibri Light" w:hAnsi="Calibri Light" w:cs="Calibri Light"/>
+          <w:b/>
+          <w:bCs/>
+          <w:sz w:val="22"/>
+          <w:szCs w:val="22"/>
+        </w:rPr>
         <w:t>Seoul National University</w:t>
       </w:r>
       <w:r>
@@ -423,20 +706,8 @@
           <w:sz w:val="20"/>
           <w:szCs w:val="20"/>
         </w:rPr>
-        <w:t xml:space="preserve">- Advisor: Professor Woo-Young </w:t>
-      </w:r>
-      <w:proofErr w:type="spellStart"/>
-      <w:r>
-        <w:rPr>
-          <w:rFonts w:ascii="Calibri Light" w:hAnsi="Calibri Light" w:cs="Calibri Light"/>
-          <w:i/>
-          <w:iCs/>
-          <w:sz w:val="20"/>
-          <w:szCs w:val="20"/>
-        </w:rPr>
-        <w:t>Ahn</w:t>
-      </w:r>
-      <w:proofErr w:type="spellEnd"/>
+        <w:t>- Advisor: Professor Woo-Young Ahn</w:t>
+      </w:r>
     </w:p>
     <w:p>
       <w:pPr>
@@ -448,6 +719,54 @@
           <w:rFonts w:ascii="Calibri Light" w:hAnsi="Calibri Light" w:cs="Calibri Light"/>
           <w:i/>
           <w:iCs/>
+          <w:sz w:val="20"/>
+          <w:szCs w:val="20"/>
+        </w:rPr>
+      </w:pPr>
+      <w:r>
+        <w:rPr>
+          <w:rFonts w:ascii="Calibri Light" w:hAnsi="Calibri Light" w:cs="Calibri Light"/>
+          <w:i/>
+          <w:iCs/>
+          <w:sz w:val="20"/>
+          <w:szCs w:val="20"/>
+        </w:rPr>
+        <w:t>- Computational Clinical Science Laboratory (</w:t>
+      </w:r>
+      <w:hyperlink r:id="rId11" w:history="1">
+        <w:r>
+          <w:rPr>
+            <w:rStyle w:val="Hyperlink"/>
+            <w:rFonts w:ascii="Calibri Light" w:hAnsi="Calibri Light" w:cs="Calibri Light"/>
+            <w:i/>
+            <w:iCs/>
+            <w:sz w:val="20"/>
+            <w:szCs w:val="20"/>
+          </w:rPr>
+          <w:t>CCS Lab</w:t>
+        </w:r>
+      </w:hyperlink>
+      <w:r>
+        <w:rPr>
+          <w:rFonts w:ascii="Calibri Light" w:hAnsi="Calibri Light" w:cs="Calibri Light"/>
+          <w:i/>
+          <w:iCs/>
+          <w:sz w:val="20"/>
+          <w:szCs w:val="20"/>
+        </w:rPr>
+        <w:t>)</w:t>
+      </w:r>
+    </w:p>
+    <w:p>
+      <w:pPr>
+        <w:tabs>
+          <w:tab w:val="left" w:pos="720"/>
+          <w:tab w:val="right" w:pos="8640"/>
+        </w:tabs>
+        <w:rPr>
+          <w:rFonts w:ascii="Calibri Light" w:hAnsi="Calibri Light" w:cs="Calibri Light"/>
+          <w:i/>
+          <w:iCs/>
         </w:rPr>
       </w:pPr>
       <w:r>
@@ -602,20 +921,8 @@
           <w:sz w:val="20"/>
           <w:szCs w:val="20"/>
         </w:rPr>
-        <w:t xml:space="preserve">- Advisor: Professor Woo-Young </w:t>
-      </w:r>
-      <w:proofErr w:type="spellStart"/>
-      <w:r>
-        <w:rPr>
-          <w:rFonts w:ascii="Calibri Light" w:hAnsi="Calibri Light" w:cs="Calibri Light"/>
-          <w:i/>
-          <w:iCs/>
-          <w:sz w:val="20"/>
-          <w:szCs w:val="20"/>
-        </w:rPr>
-        <w:t>Ahn</w:t>
-      </w:r>
-      <w:proofErr w:type="spellEnd"/>
+        <w:t>- Advisor: Professor Woo-Young Ahn</w:t>
+      </w:r>
     </w:p>
     <w:p>
       <w:pPr>
@@ -627,6 +934,54 @@
           <w:rFonts w:ascii="Calibri Light" w:hAnsi="Calibri Light" w:cs="Calibri Light"/>
           <w:i/>
           <w:iCs/>
+          <w:sz w:val="20"/>
+          <w:szCs w:val="20"/>
+        </w:rPr>
+      </w:pPr>
+      <w:r>
+        <w:rPr>
+          <w:rFonts w:ascii="Calibri Light" w:hAnsi="Calibri Light" w:cs="Calibri Light"/>
+          <w:i/>
+          <w:iCs/>
+          <w:sz w:val="20"/>
+          <w:szCs w:val="20"/>
+        </w:rPr>
+        <w:t>- Computational Clinical Science Laboratory (</w:t>
+      </w:r>
+      <w:hyperlink r:id="rId12" w:history="1">
+        <w:r>
+          <w:rPr>
+            <w:rStyle w:val="Hyperlink"/>
+            <w:rFonts w:ascii="Calibri Light" w:hAnsi="Calibri Light" w:cs="Calibri Light"/>
+            <w:i/>
+            <w:iCs/>
+            <w:sz w:val="20"/>
+            <w:szCs w:val="20"/>
+          </w:rPr>
+          <w:t>CCS Lab</w:t>
+        </w:r>
+      </w:hyperlink>
+      <w:r>
+        <w:rPr>
+          <w:rFonts w:ascii="Calibri Light" w:hAnsi="Calibri Light" w:cs="Calibri Light"/>
+          <w:i/>
+          <w:iCs/>
+          <w:sz w:val="20"/>
+          <w:szCs w:val="20"/>
+        </w:rPr>
+        <w:t>)</w:t>
+      </w:r>
+    </w:p>
+    <w:p>
+      <w:pPr>
+        <w:tabs>
+          <w:tab w:val="left" w:pos="720"/>
+          <w:tab w:val="right" w:pos="8640"/>
+        </w:tabs>
+        <w:rPr>
+          <w:rFonts w:ascii="Calibri Light" w:hAnsi="Calibri Light" w:cs="Calibri Light"/>
+          <w:i/>
+          <w:iCs/>
         </w:rPr>
       </w:pPr>
       <w:r>
@@ -865,23 +1220,13 @@
         </w:rPr>
         <w:tab/>
       </w:r>
-      <w:proofErr w:type="spellStart"/>
-      <w:r>
-        <w:rPr>
-          <w:rFonts w:ascii="Calibri Light" w:hAnsi="Calibri Light" w:cs="Calibri Light"/>
-          <w:sz w:val="20"/>
-          <w:szCs w:val="20"/>
-        </w:rPr>
-        <w:t>StonyBrook</w:t>
-      </w:r>
-      <w:proofErr w:type="spellEnd"/>
-      <w:r>
-        <w:rPr>
-          <w:rFonts w:ascii="Calibri Light" w:hAnsi="Calibri Light" w:cs="Calibri Light"/>
-          <w:sz w:val="20"/>
-          <w:szCs w:val="20"/>
-        </w:rPr>
-        <w:t>, NY</w:t>
+      <w:r>
+        <w:rPr>
+          <w:rFonts w:ascii="Calibri Light" w:hAnsi="Calibri Light" w:cs="Calibri Light"/>
+          <w:sz w:val="20"/>
+          <w:szCs w:val="20"/>
+        </w:rPr>
+        <w:t>StonyBrook, NY</w:t>
       </w:r>
     </w:p>
     <w:p>
@@ -1097,25 +1442,7 @@
           <w:sz w:val="22"/>
           <w:lang w:eastAsia="ko-KR"/>
         </w:rPr>
-        <w:t xml:space="preserve">ark, H., </w:t>
-      </w:r>
-      <w:proofErr w:type="spellStart"/>
-      <w:r>
-        <w:rPr>
-          <w:rFonts w:ascii="Calibri Light" w:hAnsi="Calibri Light" w:cs="Calibri Light"/>
-          <w:sz w:val="22"/>
-          <w:lang w:eastAsia="ko-KR"/>
-        </w:rPr>
-        <w:t>Ahn</w:t>
-      </w:r>
-      <w:proofErr w:type="spellEnd"/>
-      <w:r>
-        <w:rPr>
-          <w:rFonts w:ascii="Calibri Light" w:hAnsi="Calibri Light" w:cs="Calibri Light"/>
-          <w:sz w:val="22"/>
-          <w:lang w:eastAsia="ko-KR"/>
-        </w:rPr>
-        <w:t>, W.</w:t>
+        <w:t>ark, H., Ahn, W.</w:t>
       </w:r>
       <w:r>
         <w:rPr>
@@ -1181,45 +1508,17 @@
           <w:sz w:val="22"/>
           <w:lang w:eastAsia="ko-KR"/>
         </w:rPr>
-        <w:t xml:space="preserve">Neural correlates of </w:t>
-      </w:r>
-      <w:r>
-        <w:rPr>
-          <w:rFonts w:ascii="Calibri Light" w:hAnsi="Calibri Light" w:cs="Calibri Light"/>
-          <w:sz w:val="22"/>
-          <w:lang w:eastAsia="ko-KR"/>
-        </w:rPr>
-        <w:t xml:space="preserve">model-based behavior in </w:t>
-      </w:r>
-      <w:r>
-        <w:rPr>
-          <w:rFonts w:ascii="Calibri Light" w:hAnsi="Calibri Light" w:cs="Calibri Light"/>
-          <w:sz w:val="22"/>
-          <w:lang w:eastAsia="ko-KR"/>
-        </w:rPr>
-        <w:t xml:space="preserve">internet gaming disorder and alcohol use disorder, </w:t>
-      </w:r>
-      <w:proofErr w:type="spellStart"/>
-      <w:r>
-        <w:rPr>
-          <w:rFonts w:ascii="Calibri Light" w:hAnsi="Calibri Light" w:cs="Calibri Light"/>
-          <w:i/>
-          <w:iCs/>
-          <w:sz w:val="22"/>
-          <w:lang w:eastAsia="ko-KR"/>
-        </w:rPr>
-        <w:t>bioRxiv</w:t>
-      </w:r>
-      <w:proofErr w:type="spellEnd"/>
-      <w:r>
-        <w:rPr>
-          <w:rFonts w:ascii="Calibri Light" w:hAnsi="Calibri Light" w:cs="Calibri Light"/>
-          <w:i/>
-          <w:iCs/>
-          <w:sz w:val="22"/>
-          <w:lang w:eastAsia="ko-KR"/>
-        </w:rPr>
-        <w:t xml:space="preserve">, </w:t>
+        <w:t xml:space="preserve">Neural correlates of model-based behavior in internet gaming disorder and alcohol use disorder, </w:t>
+      </w:r>
+      <w:r>
+        <w:rPr>
+          <w:rFonts w:ascii="Calibri Light" w:hAnsi="Calibri Light" w:cs="Calibri Light"/>
+          <w:i/>
+          <w:iCs/>
+          <w:sz w:val="22"/>
+          <w:lang w:eastAsia="ko-KR"/>
+        </w:rPr>
+        <w:t xml:space="preserve">bioRxiv, </w:t>
       </w:r>
       <w:r>
         <w:rPr>
@@ -1260,6 +1559,7 @@
           <w:sz w:val="22"/>
           <w:lang w:eastAsia="ko-KR"/>
         </w:rPr>
+        <w:lastRenderedPageBreak/>
         <w:t>Kwon, M.,</w:t>
       </w:r>
       <w:r>
@@ -1278,49 +1578,21 @@
         </w:rPr>
         <w:t xml:space="preserve">Lee, Y., </w:t>
       </w:r>
-      <w:proofErr w:type="spellStart"/>
-      <w:r>
-        <w:rPr>
-          <w:rFonts w:ascii="Calibri Light" w:hAnsi="Calibri Light" w:cs="Calibri Light"/>
-          <w:sz w:val="22"/>
-          <w:lang w:eastAsia="ko-KR"/>
-        </w:rPr>
-        <w:t>Hur</w:t>
-      </w:r>
-      <w:proofErr w:type="spellEnd"/>
-      <w:r>
-        <w:rPr>
-          <w:rFonts w:ascii="Calibri Light" w:hAnsi="Calibri Light" w:cs="Calibri Light"/>
-          <w:sz w:val="22"/>
-          <w:lang w:eastAsia="ko-KR"/>
-        </w:rPr>
-        <w:t xml:space="preserve">, J., Lee, T.-H., &amp; </w:t>
-      </w:r>
-      <w:proofErr w:type="spellStart"/>
-      <w:r>
-        <w:rPr>
-          <w:rFonts w:ascii="Calibri Light" w:hAnsi="Calibri Light" w:cs="Calibri Light"/>
-          <w:sz w:val="22"/>
-          <w:lang w:eastAsia="ko-KR"/>
-        </w:rPr>
-        <w:t>Ahn</w:t>
-      </w:r>
-      <w:proofErr w:type="spellEnd"/>
-      <w:r>
-        <w:rPr>
-          <w:rFonts w:ascii="Calibri Light" w:hAnsi="Calibri Light" w:cs="Calibri Light"/>
-          <w:sz w:val="22"/>
-          <w:lang w:eastAsia="ko-KR"/>
-        </w:rPr>
-        <w:t>, W.-Y. (</w:t>
-      </w:r>
-      <w:r>
-        <w:rPr>
-          <w:rFonts w:ascii="Calibri Light" w:hAnsi="Calibri Light" w:cs="Calibri Light"/>
-          <w:sz w:val="22"/>
-          <w:lang w:eastAsia="ko-KR"/>
-        </w:rPr>
-        <w:t>in press</w:t>
+      <w:r>
+        <w:rPr>
+          <w:rFonts w:ascii="Calibri Light" w:hAnsi="Calibri Light" w:cs="Calibri Light"/>
+          <w:sz w:val="22"/>
+          <w:lang w:eastAsia="ko-KR"/>
+        </w:rPr>
+        <w:t>Hur, J., Lee, T.-H., &amp; Ahn, W.-Y. (</w:t>
+      </w:r>
+      <w:r>
+        <w:rPr>
+          <w:rFonts w:ascii="Calibri Light" w:hAnsi="Calibri Light" w:cs="Calibri Light"/>
+          <w:sz w:val="22"/>
+          <w:lang w:eastAsia="ko-KR"/>
+        </w:rPr>
+        <w:t>2024</w:t>
       </w:r>
       <w:r>
         <w:rPr>
@@ -1362,15 +1634,23 @@
           <w:sz w:val="22"/>
           <w:lang w:eastAsia="ko-KR"/>
         </w:rPr>
-        <w:t>, https://doi.org/10.1101/2021.02.17.4317</w:t>
-      </w:r>
-      <w:r>
-        <w:rPr>
-          <w:rFonts w:ascii="Calibri Light" w:hAnsi="Calibri Light" w:cs="Calibri Light"/>
-          <w:sz w:val="22"/>
-          <w:lang w:eastAsia="ko-KR"/>
-        </w:rPr>
-        <w:t>18</w:t>
+        <w:t>,</w:t>
+      </w:r>
+      <w:r>
+        <w:rPr>
+          <w:rFonts w:ascii="Calibri Light" w:hAnsi="Calibri Light" w:cs="Calibri Light"/>
+          <w:sz w:val="22"/>
+          <w:lang w:eastAsia="ko-KR"/>
+        </w:rPr>
+        <w:t xml:space="preserve"> </w:t>
+      </w:r>
+      <w:r>
+        <w:rPr>
+          <w:rFonts w:ascii="Calibri Light" w:hAnsi="Calibri Light" w:cs="Calibri Light"/>
+          <w:sz w:val="22"/>
+          <w:lang w:eastAsia="ko-KR"/>
+        </w:rPr>
+        <w:t>https://dx.doi.org/10.1080/10826084.2023.2259471</w:t>
       </w:r>
       <w:r>
         <w:rPr>
@@ -1439,25 +1719,7 @@
           <w:sz w:val="22"/>
           <w:lang w:eastAsia="ko-KR"/>
         </w:rPr>
-        <w:t xml:space="preserve">., &amp; </w:t>
-      </w:r>
-      <w:proofErr w:type="spellStart"/>
-      <w:r>
-        <w:rPr>
-          <w:rFonts w:ascii="Calibri Light" w:hAnsi="Calibri Light" w:cs="Calibri Light"/>
-          <w:sz w:val="22"/>
-          <w:lang w:eastAsia="ko-KR"/>
-        </w:rPr>
-        <w:t>Ahn</w:t>
-      </w:r>
-      <w:proofErr w:type="spellEnd"/>
-      <w:r>
-        <w:rPr>
-          <w:rFonts w:ascii="Calibri Light" w:hAnsi="Calibri Light" w:cs="Calibri Light"/>
-          <w:sz w:val="22"/>
-          <w:lang w:eastAsia="ko-KR"/>
-        </w:rPr>
-        <w:t>, W.-Y. (</w:t>
+        <w:t>., &amp; Ahn, W.-Y. (</w:t>
       </w:r>
       <w:r>
         <w:rPr>
@@ -1586,26 +1848,15 @@
           <w:sz w:val="22"/>
           <w:lang w:eastAsia="ko-KR"/>
         </w:rPr>
-        <w:lastRenderedPageBreak/>
         <w:t xml:space="preserve">Kim, H., </w:t>
       </w:r>
-      <w:proofErr w:type="spellStart"/>
-      <w:r>
-        <w:rPr>
-          <w:rFonts w:ascii="Calibri Light" w:hAnsi="Calibri Light" w:cs="Calibri Light"/>
-          <w:sz w:val="22"/>
-          <w:lang w:eastAsia="ko-KR"/>
-        </w:rPr>
-        <w:t>Hur</w:t>
-      </w:r>
-      <w:proofErr w:type="spellEnd"/>
-      <w:r>
-        <w:rPr>
-          <w:rFonts w:ascii="Calibri Light" w:hAnsi="Calibri Light" w:cs="Calibri Light"/>
-          <w:sz w:val="22"/>
-          <w:lang w:eastAsia="ko-KR"/>
-        </w:rPr>
-        <w:t xml:space="preserve">, J. K., </w:t>
+      <w:r>
+        <w:rPr>
+          <w:rFonts w:ascii="Calibri Light" w:hAnsi="Calibri Light" w:cs="Calibri Light"/>
+          <w:sz w:val="22"/>
+          <w:lang w:eastAsia="ko-KR"/>
+        </w:rPr>
+        <w:t xml:space="preserve">Hur, J. K., </w:t>
       </w:r>
       <w:r>
         <w:rPr>
@@ -1623,43 +1874,7 @@
           <w:sz w:val="22"/>
           <w:lang w:eastAsia="ko-KR"/>
         </w:rPr>
-        <w:t xml:space="preserve">, Kim, S., </w:t>
-      </w:r>
-      <w:proofErr w:type="spellStart"/>
-      <w:r>
-        <w:rPr>
-          <w:rFonts w:ascii="Calibri Light" w:hAnsi="Calibri Light" w:cs="Calibri Light"/>
-          <w:sz w:val="22"/>
-          <w:lang w:eastAsia="ko-KR"/>
-        </w:rPr>
-        <w:t>Zoh</w:t>
-      </w:r>
-      <w:proofErr w:type="spellEnd"/>
-      <w:r>
-        <w:rPr>
-          <w:rFonts w:ascii="Calibri Light" w:hAnsi="Calibri Light" w:cs="Calibri Light"/>
-          <w:sz w:val="22"/>
-          <w:lang w:eastAsia="ko-KR"/>
-        </w:rPr>
-        <w:t xml:space="preserve">, Y., &amp; </w:t>
-      </w:r>
-      <w:proofErr w:type="spellStart"/>
-      <w:r>
-        <w:rPr>
-          <w:rFonts w:ascii="Calibri Light" w:hAnsi="Calibri Light" w:cs="Calibri Light"/>
-          <w:sz w:val="22"/>
-          <w:lang w:eastAsia="ko-KR"/>
-        </w:rPr>
-        <w:t>Ahn</w:t>
-      </w:r>
-      <w:proofErr w:type="spellEnd"/>
-      <w:r>
-        <w:rPr>
-          <w:rFonts w:ascii="Calibri Light" w:hAnsi="Calibri Light" w:cs="Calibri Light"/>
-          <w:sz w:val="22"/>
-          <w:lang w:eastAsia="ko-KR"/>
-        </w:rPr>
-        <w:t xml:space="preserve">, W.-Y </w:t>
+        <w:t xml:space="preserve">, Kim, S., Zoh, Y., &amp; Ahn, W.-Y </w:t>
       </w:r>
       <w:r>
         <w:rPr>
@@ -1893,25 +2108,7 @@
           <w:sz w:val="22"/>
           <w:lang w:eastAsia="ko-KR"/>
         </w:rPr>
-        <w:t xml:space="preserve">ark, H., </w:t>
-      </w:r>
-      <w:proofErr w:type="spellStart"/>
-      <w:r>
-        <w:rPr>
-          <w:rFonts w:ascii="Calibri Light" w:hAnsi="Calibri Light" w:cs="Calibri Light"/>
-          <w:sz w:val="22"/>
-          <w:lang w:eastAsia="ko-KR"/>
-        </w:rPr>
-        <w:t>Ahn</w:t>
-      </w:r>
-      <w:proofErr w:type="spellEnd"/>
-      <w:r>
-        <w:rPr>
-          <w:rFonts w:ascii="Calibri Light" w:hAnsi="Calibri Light" w:cs="Calibri Light"/>
-          <w:sz w:val="22"/>
-          <w:lang w:eastAsia="ko-KR"/>
-        </w:rPr>
-        <w:t>, W.</w:t>
+        <w:t>ark, H., Ahn, W.</w:t>
       </w:r>
       <w:r>
         <w:rPr>
@@ -2066,41 +2263,13 @@
         </w:rPr>
         <w:t xml:space="preserve">Lee, Y., </w:t>
       </w:r>
-      <w:proofErr w:type="spellStart"/>
-      <w:r>
-        <w:rPr>
-          <w:rFonts w:ascii="Calibri Light" w:hAnsi="Calibri Light" w:cs="Calibri Light"/>
-          <w:sz w:val="22"/>
-          <w:lang w:eastAsia="ko-KR"/>
-        </w:rPr>
-        <w:t>Hur</w:t>
-      </w:r>
-      <w:proofErr w:type="spellEnd"/>
-      <w:r>
-        <w:rPr>
-          <w:rFonts w:ascii="Calibri Light" w:hAnsi="Calibri Light" w:cs="Calibri Light"/>
-          <w:sz w:val="22"/>
-          <w:lang w:eastAsia="ko-KR"/>
-        </w:rPr>
-        <w:t xml:space="preserve">, J., Lee, T.-H., &amp; </w:t>
-      </w:r>
-      <w:proofErr w:type="spellStart"/>
-      <w:r>
-        <w:rPr>
-          <w:rFonts w:ascii="Calibri Light" w:hAnsi="Calibri Light" w:cs="Calibri Light"/>
-          <w:sz w:val="22"/>
-          <w:lang w:eastAsia="ko-KR"/>
-        </w:rPr>
-        <w:t>Ahn</w:t>
-      </w:r>
-      <w:proofErr w:type="spellEnd"/>
-      <w:r>
-        <w:rPr>
-          <w:rFonts w:ascii="Calibri Light" w:hAnsi="Calibri Light" w:cs="Calibri Light"/>
-          <w:sz w:val="22"/>
-          <w:lang w:eastAsia="ko-KR"/>
-        </w:rPr>
-        <w:t xml:space="preserve">, W.-Y. </w:t>
+      <w:r>
+        <w:rPr>
+          <w:rFonts w:ascii="Calibri Light" w:hAnsi="Calibri Light" w:cs="Calibri Light"/>
+          <w:sz w:val="22"/>
+          <w:lang w:eastAsia="ko-KR"/>
+        </w:rPr>
+        <w:t xml:space="preserve">Hur, J., Lee, T.-H., &amp; Ahn, W.-Y. </w:t>
       </w:r>
       <w:r>
         <w:rPr>
@@ -2218,25 +2387,7 @@
           <w:sz w:val="22"/>
           <w:lang w:eastAsia="ko-KR"/>
         </w:rPr>
-        <w:t xml:space="preserve">ark, H., </w:t>
-      </w:r>
-      <w:proofErr w:type="spellStart"/>
-      <w:r>
-        <w:rPr>
-          <w:rFonts w:ascii="Calibri Light" w:hAnsi="Calibri Light" w:cs="Calibri Light"/>
-          <w:sz w:val="22"/>
-          <w:lang w:eastAsia="ko-KR"/>
-        </w:rPr>
-        <w:t>Ahn</w:t>
-      </w:r>
-      <w:proofErr w:type="spellEnd"/>
-      <w:r>
-        <w:rPr>
-          <w:rFonts w:ascii="Calibri Light" w:hAnsi="Calibri Light" w:cs="Calibri Light"/>
-          <w:sz w:val="22"/>
-          <w:lang w:eastAsia="ko-KR"/>
-        </w:rPr>
-        <w:t>, W.</w:t>
+        <w:t>ark, H., Ahn, W.</w:t>
       </w:r>
       <w:r>
         <w:rPr>
@@ -2433,41 +2584,13 @@
         </w:rPr>
         <w:t xml:space="preserve">Lee, Y., </w:t>
       </w:r>
-      <w:proofErr w:type="spellStart"/>
-      <w:r>
-        <w:rPr>
-          <w:rFonts w:ascii="Calibri Light" w:hAnsi="Calibri Light" w:cs="Calibri Light"/>
-          <w:sz w:val="22"/>
-          <w:lang w:eastAsia="ko-KR"/>
-        </w:rPr>
-        <w:t>Hur</w:t>
-      </w:r>
-      <w:proofErr w:type="spellEnd"/>
-      <w:r>
-        <w:rPr>
-          <w:rFonts w:ascii="Calibri Light" w:hAnsi="Calibri Light" w:cs="Calibri Light"/>
-          <w:sz w:val="22"/>
-          <w:lang w:eastAsia="ko-KR"/>
-        </w:rPr>
-        <w:t xml:space="preserve">, J., Lee, T., &amp; </w:t>
-      </w:r>
-      <w:proofErr w:type="spellStart"/>
-      <w:r>
-        <w:rPr>
-          <w:rFonts w:ascii="Calibri Light" w:hAnsi="Calibri Light" w:cs="Calibri Light"/>
-          <w:sz w:val="22"/>
-          <w:lang w:eastAsia="ko-KR"/>
-        </w:rPr>
-        <w:t>Ahn</w:t>
-      </w:r>
-      <w:proofErr w:type="spellEnd"/>
-      <w:r>
-        <w:rPr>
-          <w:rFonts w:ascii="Calibri Light" w:hAnsi="Calibri Light" w:cs="Calibri Light"/>
-          <w:sz w:val="22"/>
-          <w:lang w:eastAsia="ko-KR"/>
-        </w:rPr>
-        <w:t>, W. (</w:t>
+      <w:r>
+        <w:rPr>
+          <w:rFonts w:ascii="Calibri Light" w:hAnsi="Calibri Light" w:cs="Calibri Light"/>
+          <w:sz w:val="22"/>
+          <w:lang w:eastAsia="ko-KR"/>
+        </w:rPr>
+        <w:t>Hur, J., Lee, T., &amp; Ahn, W. (</w:t>
       </w:r>
       <w:r>
         <w:rPr>
@@ -2485,23 +2608,13 @@
         </w:rPr>
         <w:t xml:space="preserve">) </w:t>
       </w:r>
-      <w:proofErr w:type="spellStart"/>
-      <w:r>
-        <w:rPr>
-          <w:rFonts w:ascii="Calibri Light" w:hAnsi="Calibri Light" w:cs="Calibri Light"/>
-          <w:sz w:val="22"/>
-          <w:lang w:eastAsia="ko-KR"/>
-        </w:rPr>
-        <w:t>Neuroforecasting</w:t>
-      </w:r>
-      <w:proofErr w:type="spellEnd"/>
-      <w:r>
-        <w:rPr>
-          <w:rFonts w:ascii="Calibri Light" w:hAnsi="Calibri Light" w:cs="Calibri Light"/>
-          <w:sz w:val="22"/>
-          <w:lang w:eastAsia="ko-KR"/>
-        </w:rPr>
-        <w:t xml:space="preserve"> exceeds self-reports in predicting cosmetic sales: an fMRI study</w:t>
+      <w:r>
+        <w:rPr>
+          <w:rFonts w:ascii="Calibri Light" w:hAnsi="Calibri Light" w:cs="Calibri Light"/>
+          <w:sz w:val="22"/>
+          <w:lang w:eastAsia="ko-KR"/>
+        </w:rPr>
+        <w:t>Neuroforecasting exceeds self-reports in predicting cosmetic sales: an fMRI study</w:t>
       </w:r>
       <w:r>
         <w:rPr>
@@ -2604,41 +2717,13 @@
         </w:rPr>
         <w:t xml:space="preserve">Lee, Y., </w:t>
       </w:r>
-      <w:proofErr w:type="spellStart"/>
-      <w:r>
-        <w:rPr>
-          <w:rFonts w:ascii="Calibri Light" w:hAnsi="Calibri Light" w:cs="Calibri Light"/>
-          <w:sz w:val="22"/>
-          <w:lang w:eastAsia="ko-KR"/>
-        </w:rPr>
-        <w:t>Hur</w:t>
-      </w:r>
-      <w:proofErr w:type="spellEnd"/>
-      <w:r>
-        <w:rPr>
-          <w:rFonts w:ascii="Calibri Light" w:hAnsi="Calibri Light" w:cs="Calibri Light"/>
-          <w:sz w:val="22"/>
-          <w:lang w:eastAsia="ko-KR"/>
-        </w:rPr>
-        <w:t xml:space="preserve">, J., Lee, T., &amp; </w:t>
-      </w:r>
-      <w:proofErr w:type="spellStart"/>
-      <w:r>
-        <w:rPr>
-          <w:rFonts w:ascii="Calibri Light" w:hAnsi="Calibri Light" w:cs="Calibri Light"/>
-          <w:sz w:val="22"/>
-          <w:lang w:eastAsia="ko-KR"/>
-        </w:rPr>
-        <w:t>Ahn</w:t>
-      </w:r>
-      <w:proofErr w:type="spellEnd"/>
-      <w:r>
-        <w:rPr>
-          <w:rFonts w:ascii="Calibri Light" w:hAnsi="Calibri Light" w:cs="Calibri Light"/>
-          <w:sz w:val="22"/>
-          <w:lang w:eastAsia="ko-KR"/>
-        </w:rPr>
-        <w:t>, W. (</w:t>
+      <w:r>
+        <w:rPr>
+          <w:rFonts w:ascii="Calibri Light" w:hAnsi="Calibri Light" w:cs="Calibri Light"/>
+          <w:sz w:val="22"/>
+          <w:lang w:eastAsia="ko-KR"/>
+        </w:rPr>
+        <w:t>Hur, J., Lee, T., &amp; Ahn, W. (</w:t>
       </w:r>
       <w:r>
         <w:rPr>
@@ -2841,23 +2926,13 @@
         </w:rPr>
         <w:t xml:space="preserve">&amp; </w:t>
       </w:r>
-      <w:proofErr w:type="spellStart"/>
-      <w:r>
-        <w:rPr>
-          <w:rFonts w:ascii="Calibri Light" w:hAnsi="Calibri Light" w:cs="Calibri Light"/>
-          <w:sz w:val="22"/>
-          <w:lang w:eastAsia="ko-KR"/>
-        </w:rPr>
-        <w:t>Ahn</w:t>
-      </w:r>
-      <w:proofErr w:type="spellEnd"/>
-      <w:r>
-        <w:rPr>
-          <w:rFonts w:ascii="Calibri Light" w:hAnsi="Calibri Light" w:cs="Calibri Light"/>
-          <w:sz w:val="22"/>
-          <w:lang w:eastAsia="ko-KR"/>
-        </w:rPr>
-        <w:t>, W. (202</w:t>
+      <w:r>
+        <w:rPr>
+          <w:rFonts w:ascii="Calibri Light" w:hAnsi="Calibri Light" w:cs="Calibri Light"/>
+          <w:sz w:val="22"/>
+          <w:lang w:eastAsia="ko-KR"/>
+        </w:rPr>
+        <w:t>Ahn, W. (202</w:t>
       </w:r>
       <w:r>
         <w:rPr>
@@ -2999,25 +3074,7 @@
           <w:sz w:val="22"/>
           <w:lang w:eastAsia="ko-KR"/>
         </w:rPr>
-        <w:t xml:space="preserve">, </w:t>
-      </w:r>
-      <w:proofErr w:type="spellStart"/>
-      <w:r>
-        <w:rPr>
-          <w:rFonts w:ascii="Calibri Light" w:hAnsi="Calibri Light" w:cs="Calibri Light"/>
-          <w:sz w:val="22"/>
-          <w:lang w:eastAsia="ko-KR"/>
-        </w:rPr>
-        <w:t>Ahn</w:t>
-      </w:r>
-      <w:proofErr w:type="spellEnd"/>
-      <w:r>
-        <w:rPr>
-          <w:rFonts w:ascii="Calibri Light" w:hAnsi="Calibri Light" w:cs="Calibri Light"/>
-          <w:sz w:val="22"/>
-          <w:lang w:eastAsia="ko-KR"/>
-        </w:rPr>
-        <w:t xml:space="preserve">, W., &amp; Jung, Y. (2020) Neural Correlates of Goal-Directed Control in Interest Gaming Disorder and Alcohol Use Disorder, </w:t>
+        <w:t xml:space="preserve">, Ahn, W., &amp; Jung, Y. (2020) Neural Correlates of Goal-Directed Control in Interest Gaming Disorder and Alcohol Use Disorder, </w:t>
       </w:r>
       <w:r>
         <w:rPr>
@@ -3099,43 +3156,7 @@
           <w:sz w:val="22"/>
           <w:lang w:eastAsia="ko-KR"/>
         </w:rPr>
-        <w:t xml:space="preserve">, Kim, H., Yang, J., </w:t>
-      </w:r>
-      <w:proofErr w:type="spellStart"/>
-      <w:r>
-        <w:rPr>
-          <w:rFonts w:ascii="Calibri Light" w:hAnsi="Calibri Light" w:cs="Calibri Light"/>
-          <w:sz w:val="22"/>
-          <w:lang w:eastAsia="ko-KR"/>
-        </w:rPr>
-        <w:t>Hur</w:t>
-      </w:r>
-      <w:proofErr w:type="spellEnd"/>
-      <w:r>
-        <w:rPr>
-          <w:rFonts w:ascii="Calibri Light" w:hAnsi="Calibri Light" w:cs="Calibri Light"/>
-          <w:sz w:val="22"/>
-          <w:lang w:eastAsia="ko-KR"/>
-        </w:rPr>
-        <w:t xml:space="preserve">, J., Lee, T., &amp; </w:t>
-      </w:r>
-      <w:proofErr w:type="spellStart"/>
-      <w:r>
-        <w:rPr>
-          <w:rFonts w:ascii="Calibri Light" w:hAnsi="Calibri Light" w:cs="Calibri Light"/>
-          <w:sz w:val="22"/>
-          <w:lang w:eastAsia="ko-KR"/>
-        </w:rPr>
-        <w:t>Ahn</w:t>
-      </w:r>
-      <w:proofErr w:type="spellEnd"/>
-      <w:r>
-        <w:rPr>
-          <w:rFonts w:ascii="Calibri Light" w:hAnsi="Calibri Light" w:cs="Calibri Light"/>
-          <w:sz w:val="22"/>
-          <w:lang w:eastAsia="ko-KR"/>
-        </w:rPr>
-        <w:t xml:space="preserve">, W. (2019) Identifying behavioral and neural predictors of caffeinated soda intake in childhood using a large database from the ABCD study, </w:t>
+        <w:t xml:space="preserve">, Kim, H., Yang, J., Hur, J., Lee, T., &amp; Ahn, W. (2019) Identifying behavioral and neural predictors of caffeinated soda intake in childhood using a large database from the ABCD study, </w:t>
       </w:r>
       <w:r>
         <w:rPr>
@@ -3221,25 +3242,7 @@
           <w:sz w:val="22"/>
           <w:lang w:eastAsia="ko-KR"/>
         </w:rPr>
-        <w:t xml:space="preserve">., &amp; </w:t>
-      </w:r>
-      <w:proofErr w:type="spellStart"/>
-      <w:r>
-        <w:rPr>
-          <w:rFonts w:ascii="Calibri Light" w:hAnsi="Calibri Light" w:cs="Calibri Light"/>
-          <w:sz w:val="22"/>
-          <w:lang w:eastAsia="ko-KR"/>
-        </w:rPr>
-        <w:t>Ahn</w:t>
-      </w:r>
-      <w:proofErr w:type="spellEnd"/>
-      <w:r>
-        <w:rPr>
-          <w:rFonts w:ascii="Calibri Light" w:hAnsi="Calibri Light" w:cs="Calibri Light"/>
-          <w:sz w:val="22"/>
-          <w:lang w:eastAsia="ko-KR"/>
-        </w:rPr>
-        <w:t xml:space="preserve">, W. (2019) Effects of early life stress and social resources on neurocognitive functions: A large-scale replication study, </w:t>
+        <w:t xml:space="preserve">., &amp; Ahn, W. (2019) Effects of early life stress and social resources on neurocognitive functions: A large-scale replication study, </w:t>
       </w:r>
       <w:r>
         <w:rPr>
@@ -3583,18 +3586,7 @@
           <w:sz w:val="20"/>
           <w:szCs w:val="20"/>
         </w:rPr>
-        <w:t xml:space="preserve">Data collection and statistical analysis for functional </w:t>
-      </w:r>
-      <w:proofErr w:type="gramStart"/>
-      <w:r>
-        <w:rPr>
-          <w:rFonts w:ascii="Calibri Light" w:hAnsi="Calibri Light" w:cs="Calibri Light"/>
-          <w:i/>
-          <w:iCs/>
-          <w:sz w:val="20"/>
-          <w:szCs w:val="20"/>
-        </w:rPr>
-        <w:t xml:space="preserve">MRI  </w:t>
+        <w:t xml:space="preserve">Data collection and statistical analysis for functional MRI  </w:t>
       </w:r>
       <w:r>
         <w:rPr>
@@ -3606,7 +3598,6 @@
         </w:rPr>
         <w:tab/>
       </w:r>
-      <w:proofErr w:type="gramEnd"/>
       <w:r>
         <w:rPr>
           <w:rFonts w:ascii="Calibri Light" w:hAnsi="Calibri Light" w:cs="Calibri Light"/>
@@ -3774,29 +3765,7 @@
           <w:sz w:val="20"/>
           <w:szCs w:val="20"/>
         </w:rPr>
-        <w:t xml:space="preserve">Reinforcement Learning using the </w:t>
-      </w:r>
-      <w:proofErr w:type="spellStart"/>
-      <w:r>
-        <w:rPr>
-          <w:rFonts w:ascii="Calibri Light" w:hAnsi="Calibri Light" w:cs="Calibri Light"/>
-          <w:i/>
-          <w:iCs/>
-          <w:sz w:val="20"/>
-          <w:szCs w:val="20"/>
-        </w:rPr>
-        <w:t>hBayesDM</w:t>
-      </w:r>
-      <w:proofErr w:type="spellEnd"/>
-      <w:r>
-        <w:rPr>
-          <w:rFonts w:ascii="Calibri Light" w:hAnsi="Calibri Light" w:cs="Calibri Light"/>
-          <w:i/>
-          <w:iCs/>
-          <w:sz w:val="20"/>
-          <w:szCs w:val="20"/>
-        </w:rPr>
-        <w:t xml:space="preserve"> Package</w:t>
+        <w:t>Reinforcement Learning using the hBayesDM Package</w:t>
       </w:r>
       <w:r>
         <w:rPr>
@@ -4850,20 +4819,8 @@
           <w:sz w:val="20"/>
           <w:szCs w:val="20"/>
         </w:rPr>
-        <w:t xml:space="preserve">PI: Professor Woo-Young </w:t>
-      </w:r>
-      <w:proofErr w:type="spellStart"/>
-      <w:r>
-        <w:rPr>
-          <w:rFonts w:ascii="Calibri Light" w:hAnsi="Calibri Light" w:cs="Calibri Light"/>
-          <w:i/>
-          <w:iCs/>
-          <w:sz w:val="20"/>
-          <w:szCs w:val="20"/>
-        </w:rPr>
-        <w:t>Ahn</w:t>
-      </w:r>
-      <w:proofErr w:type="spellEnd"/>
+        <w:t>PI: Professor Woo-Young Ahn</w:t>
+      </w:r>
     </w:p>
     <w:p>
       <w:pPr>
@@ -5034,29 +4991,7 @@
           <w:sz w:val="20"/>
           <w:szCs w:val="20"/>
         </w:rPr>
-        <w:t xml:space="preserve">PI: Professor </w:t>
-      </w:r>
-      <w:proofErr w:type="spellStart"/>
-      <w:r>
-        <w:rPr>
-          <w:rFonts w:ascii="Calibri Light" w:hAnsi="Calibri Light" w:cs="Calibri Light"/>
-          <w:i/>
-          <w:iCs/>
-          <w:sz w:val="20"/>
-          <w:szCs w:val="20"/>
-        </w:rPr>
-        <w:t>Jeanyoung</w:t>
-      </w:r>
-      <w:proofErr w:type="spellEnd"/>
-      <w:r>
-        <w:rPr>
-          <w:rFonts w:ascii="Calibri Light" w:hAnsi="Calibri Light" w:cs="Calibri Light"/>
-          <w:i/>
-          <w:iCs/>
-          <w:sz w:val="20"/>
-          <w:szCs w:val="20"/>
-        </w:rPr>
-        <w:t xml:space="preserve"> Chey</w:t>
+        <w:t>PI: Professor Jeanyoung Chey</w:t>
       </w:r>
     </w:p>
     <w:p>
@@ -5236,29 +5171,7 @@
           <w:sz w:val="20"/>
           <w:szCs w:val="20"/>
         </w:rPr>
-        <w:t xml:space="preserve">PI: Research Professor </w:t>
-      </w:r>
-      <w:proofErr w:type="spellStart"/>
-      <w:r>
-        <w:rPr>
-          <w:rFonts w:ascii="Calibri Light" w:hAnsi="Calibri Light" w:cs="Calibri Light"/>
-          <w:i/>
-          <w:iCs/>
-          <w:sz w:val="20"/>
-          <w:szCs w:val="20"/>
-        </w:rPr>
-        <w:t>Sungshin</w:t>
-      </w:r>
-      <w:proofErr w:type="spellEnd"/>
-      <w:r>
-        <w:rPr>
-          <w:rFonts w:ascii="Calibri Light" w:hAnsi="Calibri Light" w:cs="Calibri Light"/>
-          <w:i/>
-          <w:iCs/>
-          <w:sz w:val="20"/>
-          <w:szCs w:val="20"/>
-        </w:rPr>
-        <w:t xml:space="preserve"> Kim</w:t>
+        <w:t>PI: Research Professor Sungshin Kim</w:t>
       </w:r>
     </w:p>
     <w:p>
@@ -6576,7 +6489,6 @@
         </w:rPr>
         <w:t xml:space="preserve">Stan, </w:t>
       </w:r>
-      <w:proofErr w:type="spellStart"/>
       <w:r>
         <w:rPr>
           <w:rFonts w:ascii="Calibri Light" w:hAnsi="Calibri Light" w:cs="Calibri Light"/>
@@ -6593,7 +6505,6 @@
         </w:rPr>
         <w:t>atlab</w:t>
       </w:r>
-      <w:proofErr w:type="spellEnd"/>
     </w:p>
     <w:p>
       <w:pPr>
@@ -6686,7 +6597,6 @@
         </w:rPr>
         <w:t xml:space="preserve"> SPM, </w:t>
       </w:r>
-      <w:proofErr w:type="spellStart"/>
       <w:r>
         <w:rPr>
           <w:rFonts w:ascii="Calibri Light" w:hAnsi="Calibri Light" w:cs="Calibri Light"/>
@@ -6701,16 +6611,7 @@
           <w:sz w:val="22"/>
           <w:szCs w:val="22"/>
         </w:rPr>
-        <w:t>ilearn</w:t>
-      </w:r>
-      <w:proofErr w:type="spellEnd"/>
-      <w:r>
-        <w:rPr>
-          <w:rFonts w:ascii="Calibri Light" w:hAnsi="Calibri Light" w:cs="Calibri Light"/>
-          <w:sz w:val="22"/>
-          <w:szCs w:val="22"/>
-        </w:rPr>
-        <w:t xml:space="preserve"> </w:t>
+        <w:t xml:space="preserve">ilearn </w:t>
       </w:r>
     </w:p>
     <w:p>
@@ -6821,20 +6722,8 @@
           <w:sz w:val="22"/>
           <w:szCs w:val="22"/>
         </w:rPr>
-        <w:t xml:space="preserve">Professor Woo-Young </w:t>
-      </w:r>
-      <w:proofErr w:type="spellStart"/>
-      <w:r>
-        <w:rPr>
-          <w:rFonts w:ascii="Calibri Light" w:hAnsi="Calibri Light" w:cs="Calibri Light"/>
-          <w:b/>
-          <w:bCs/>
-          <w:sz w:val="22"/>
-          <w:szCs w:val="22"/>
-        </w:rPr>
-        <w:t>Ahn</w:t>
-      </w:r>
-      <w:proofErr w:type="spellEnd"/>
+        <w:t>Professor Woo-Young Ahn</w:t>
+      </w:r>
     </w:p>
     <w:p>
       <w:pPr>
@@ -6901,7 +6790,7 @@
         </w:rPr>
         <w:t xml:space="preserve">Email: </w:t>
       </w:r>
-      <w:hyperlink r:id="rId10" w:history="1">
+      <w:hyperlink r:id="rId13" w:history="1">
         <w:r>
           <w:rPr>
             <w:rStyle w:val="Hyperlink"/>
@@ -7045,7 +6934,7 @@
       </w:r>
     </w:p>
     <w:sectPr>
-      <w:footerReference w:type="default" r:id="rId11"/>
+      <w:footerReference w:type="default" r:id="rId14"/>
       <w:pgSz w:w="12240" w:h="15840"/>
       <w:pgMar w:top="1440" w:right="1440" w:bottom="1440" w:left="1800" w:header="720" w:footer="720" w:gutter="0"/>
       <w:cols w:space="720"/>

</xml_diff>

<commit_message>
update CV.dox - add SfN oral
</commit_message>
<xml_diff>
--- a/files/CV_minakwon.docx
+++ b/files/CV_minakwon.docx
@@ -355,6 +355,7 @@
         </w:rPr>
         <w:tab/>
       </w:r>
+      <w:proofErr w:type="spellStart"/>
       <w:r>
         <w:rPr>
           <w:rFonts w:ascii="Calibri Light" w:hAnsi="Calibri Light" w:cs="Calibri Light"/>
@@ -363,6 +364,7 @@
         </w:rPr>
         <w:t>Chicago</w:t>
       </w:r>
+      <w:proofErr w:type="spellEnd"/>
       <w:r>
         <w:rPr>
           <w:rFonts w:ascii="Calibri Light" w:hAnsi="Calibri Light" w:cs="Calibri Light"/>
@@ -706,8 +708,20 @@
           <w:sz w:val="20"/>
           <w:szCs w:val="20"/>
         </w:rPr>
-        <w:t>- Advisor: Professor Woo-Young Ahn</w:t>
-      </w:r>
+        <w:t xml:space="preserve">- Advisor: Professor Woo-Young </w:t>
+      </w:r>
+      <w:proofErr w:type="spellStart"/>
+      <w:r>
+        <w:rPr>
+          <w:rFonts w:ascii="Calibri Light" w:hAnsi="Calibri Light" w:cs="Calibri Light"/>
+          <w:i/>
+          <w:iCs/>
+          <w:sz w:val="20"/>
+          <w:szCs w:val="20"/>
+        </w:rPr>
+        <w:t>Ahn</w:t>
+      </w:r>
+      <w:proofErr w:type="spellEnd"/>
     </w:p>
     <w:p>
       <w:pPr>
@@ -921,8 +935,20 @@
           <w:sz w:val="20"/>
           <w:szCs w:val="20"/>
         </w:rPr>
-        <w:t>- Advisor: Professor Woo-Young Ahn</w:t>
-      </w:r>
+        <w:t xml:space="preserve">- Advisor: Professor Woo-Young </w:t>
+      </w:r>
+      <w:proofErr w:type="spellStart"/>
+      <w:r>
+        <w:rPr>
+          <w:rFonts w:ascii="Calibri Light" w:hAnsi="Calibri Light" w:cs="Calibri Light"/>
+          <w:i/>
+          <w:iCs/>
+          <w:sz w:val="20"/>
+          <w:szCs w:val="20"/>
+        </w:rPr>
+        <w:t>Ahn</w:t>
+      </w:r>
+      <w:proofErr w:type="spellEnd"/>
     </w:p>
     <w:p>
       <w:pPr>
@@ -1220,13 +1246,23 @@
         </w:rPr>
         <w:tab/>
       </w:r>
-      <w:r>
-        <w:rPr>
-          <w:rFonts w:ascii="Calibri Light" w:hAnsi="Calibri Light" w:cs="Calibri Light"/>
-          <w:sz w:val="20"/>
-          <w:szCs w:val="20"/>
-        </w:rPr>
-        <w:t>StonyBrook, NY</w:t>
+      <w:proofErr w:type="spellStart"/>
+      <w:r>
+        <w:rPr>
+          <w:rFonts w:ascii="Calibri Light" w:hAnsi="Calibri Light" w:cs="Calibri Light"/>
+          <w:sz w:val="20"/>
+          <w:szCs w:val="20"/>
+        </w:rPr>
+        <w:t>StonyBrook</w:t>
+      </w:r>
+      <w:proofErr w:type="spellEnd"/>
+      <w:r>
+        <w:rPr>
+          <w:rFonts w:ascii="Calibri Light" w:hAnsi="Calibri Light" w:cs="Calibri Light"/>
+          <w:sz w:val="20"/>
+          <w:szCs w:val="20"/>
+        </w:rPr>
+        <w:t>, NY</w:t>
       </w:r>
     </w:p>
     <w:p>
@@ -1420,7 +1456,25 @@
           <w:sz w:val="22"/>
           <w:lang w:eastAsia="ko-KR"/>
         </w:rPr>
-        <w:t>ark, H., Ahn, W.</w:t>
+        <w:t xml:space="preserve">ark, H., </w:t>
+      </w:r>
+      <w:proofErr w:type="spellStart"/>
+      <w:r>
+        <w:rPr>
+          <w:rFonts w:ascii="Calibri Light" w:hAnsi="Calibri Light" w:cs="Calibri Light"/>
+          <w:sz w:val="22"/>
+          <w:lang w:eastAsia="ko-KR"/>
+        </w:rPr>
+        <w:t>Ahn</w:t>
+      </w:r>
+      <w:proofErr w:type="spellEnd"/>
+      <w:r>
+        <w:rPr>
+          <w:rFonts w:ascii="Calibri Light" w:hAnsi="Calibri Light" w:cs="Calibri Light"/>
+          <w:sz w:val="22"/>
+          <w:lang w:eastAsia="ko-KR"/>
+        </w:rPr>
+        <w:t>, W.</w:t>
       </w:r>
       <w:r>
         <w:rPr>
@@ -1488,15 +1542,27 @@
         </w:rPr>
         <w:t xml:space="preserve">Neural correlates of model-based behavior in internet gaming disorder and alcohol use disorder, </w:t>
       </w:r>
-      <w:r>
-        <w:rPr>
-          <w:rFonts w:ascii="Calibri Light" w:hAnsi="Calibri Light" w:cs="Calibri Light"/>
-          <w:i/>
-          <w:iCs/>
-          <w:sz w:val="22"/>
-          <w:lang w:eastAsia="ko-KR"/>
-        </w:rPr>
-        <w:t xml:space="preserve">bioRxiv, </w:t>
+      <w:proofErr w:type="spellStart"/>
+      <w:r>
+        <w:rPr>
+          <w:rFonts w:ascii="Calibri Light" w:hAnsi="Calibri Light" w:cs="Calibri Light"/>
+          <w:i/>
+          <w:iCs/>
+          <w:sz w:val="22"/>
+          <w:lang w:eastAsia="ko-KR"/>
+        </w:rPr>
+        <w:t>bioRxiv</w:t>
+      </w:r>
+      <w:proofErr w:type="spellEnd"/>
+      <w:r>
+        <w:rPr>
+          <w:rFonts w:ascii="Calibri Light" w:hAnsi="Calibri Light" w:cs="Calibri Light"/>
+          <w:i/>
+          <w:iCs/>
+          <w:sz w:val="22"/>
+          <w:lang w:eastAsia="ko-KR"/>
+        </w:rPr>
+        <w:t xml:space="preserve">, </w:t>
       </w:r>
       <w:r>
         <w:rPr>
@@ -1556,13 +1622,41 @@
         </w:rPr>
         <w:t xml:space="preserve">Lee, Y., </w:t>
       </w:r>
-      <w:r>
-        <w:rPr>
-          <w:rFonts w:ascii="Calibri Light" w:hAnsi="Calibri Light" w:cs="Calibri Light"/>
-          <w:sz w:val="22"/>
-          <w:lang w:eastAsia="ko-KR"/>
-        </w:rPr>
-        <w:t>Hur, J., Lee, T.-H., &amp; Ahn, W.-Y. (</w:t>
+      <w:proofErr w:type="spellStart"/>
+      <w:r>
+        <w:rPr>
+          <w:rFonts w:ascii="Calibri Light" w:hAnsi="Calibri Light" w:cs="Calibri Light"/>
+          <w:sz w:val="22"/>
+          <w:lang w:eastAsia="ko-KR"/>
+        </w:rPr>
+        <w:t>Hur</w:t>
+      </w:r>
+      <w:proofErr w:type="spellEnd"/>
+      <w:r>
+        <w:rPr>
+          <w:rFonts w:ascii="Calibri Light" w:hAnsi="Calibri Light" w:cs="Calibri Light"/>
+          <w:sz w:val="22"/>
+          <w:lang w:eastAsia="ko-KR"/>
+        </w:rPr>
+        <w:t xml:space="preserve">, J., Lee, T.-H., &amp; </w:t>
+      </w:r>
+      <w:proofErr w:type="spellStart"/>
+      <w:r>
+        <w:rPr>
+          <w:rFonts w:ascii="Calibri Light" w:hAnsi="Calibri Light" w:cs="Calibri Light"/>
+          <w:sz w:val="22"/>
+          <w:lang w:eastAsia="ko-KR"/>
+        </w:rPr>
+        <w:t>Ahn</w:t>
+      </w:r>
+      <w:proofErr w:type="spellEnd"/>
+      <w:r>
+        <w:rPr>
+          <w:rFonts w:ascii="Calibri Light" w:hAnsi="Calibri Light" w:cs="Calibri Light"/>
+          <w:sz w:val="22"/>
+          <w:lang w:eastAsia="ko-KR"/>
+        </w:rPr>
+        <w:t>, W.-Y. (</w:t>
       </w:r>
       <w:r>
         <w:rPr>
@@ -1697,7 +1791,25 @@
           <w:sz w:val="22"/>
           <w:lang w:eastAsia="ko-KR"/>
         </w:rPr>
-        <w:t>., &amp; Ahn, W.-Y. (</w:t>
+        <w:t xml:space="preserve">., &amp; </w:t>
+      </w:r>
+      <w:proofErr w:type="spellStart"/>
+      <w:r>
+        <w:rPr>
+          <w:rFonts w:ascii="Calibri Light" w:hAnsi="Calibri Light" w:cs="Calibri Light"/>
+          <w:sz w:val="22"/>
+          <w:lang w:eastAsia="ko-KR"/>
+        </w:rPr>
+        <w:t>Ahn</w:t>
+      </w:r>
+      <w:proofErr w:type="spellEnd"/>
+      <w:r>
+        <w:rPr>
+          <w:rFonts w:ascii="Calibri Light" w:hAnsi="Calibri Light" w:cs="Calibri Light"/>
+          <w:sz w:val="22"/>
+          <w:lang w:eastAsia="ko-KR"/>
+        </w:rPr>
+        <w:t>, W.-Y. (</w:t>
       </w:r>
       <w:r>
         <w:rPr>
@@ -1828,13 +1940,23 @@
         </w:rPr>
         <w:t xml:space="preserve">Kim, H., </w:t>
       </w:r>
-      <w:r>
-        <w:rPr>
-          <w:rFonts w:ascii="Calibri Light" w:hAnsi="Calibri Light" w:cs="Calibri Light"/>
-          <w:sz w:val="22"/>
-          <w:lang w:eastAsia="ko-KR"/>
-        </w:rPr>
-        <w:t xml:space="preserve">Hur, J. K., </w:t>
+      <w:proofErr w:type="spellStart"/>
+      <w:r>
+        <w:rPr>
+          <w:rFonts w:ascii="Calibri Light" w:hAnsi="Calibri Light" w:cs="Calibri Light"/>
+          <w:sz w:val="22"/>
+          <w:lang w:eastAsia="ko-KR"/>
+        </w:rPr>
+        <w:t>Hur</w:t>
+      </w:r>
+      <w:proofErr w:type="spellEnd"/>
+      <w:r>
+        <w:rPr>
+          <w:rFonts w:ascii="Calibri Light" w:hAnsi="Calibri Light" w:cs="Calibri Light"/>
+          <w:sz w:val="22"/>
+          <w:lang w:eastAsia="ko-KR"/>
+        </w:rPr>
+        <w:t xml:space="preserve">, J. K., </w:t>
       </w:r>
       <w:r>
         <w:rPr>
@@ -1852,7 +1974,43 @@
           <w:sz w:val="22"/>
           <w:lang w:eastAsia="ko-KR"/>
         </w:rPr>
-        <w:t xml:space="preserve">, Kim, S., Zoh, Y., &amp; Ahn, W.-Y </w:t>
+        <w:t xml:space="preserve">, Kim, S., </w:t>
+      </w:r>
+      <w:proofErr w:type="spellStart"/>
+      <w:r>
+        <w:rPr>
+          <w:rFonts w:ascii="Calibri Light" w:hAnsi="Calibri Light" w:cs="Calibri Light"/>
+          <w:sz w:val="22"/>
+          <w:lang w:eastAsia="ko-KR"/>
+        </w:rPr>
+        <w:t>Zoh</w:t>
+      </w:r>
+      <w:proofErr w:type="spellEnd"/>
+      <w:r>
+        <w:rPr>
+          <w:rFonts w:ascii="Calibri Light" w:hAnsi="Calibri Light" w:cs="Calibri Light"/>
+          <w:sz w:val="22"/>
+          <w:lang w:eastAsia="ko-KR"/>
+        </w:rPr>
+        <w:t xml:space="preserve">, Y., &amp; </w:t>
+      </w:r>
+      <w:proofErr w:type="spellStart"/>
+      <w:r>
+        <w:rPr>
+          <w:rFonts w:ascii="Calibri Light" w:hAnsi="Calibri Light" w:cs="Calibri Light"/>
+          <w:sz w:val="22"/>
+          <w:lang w:eastAsia="ko-KR"/>
+        </w:rPr>
+        <w:t>Ahn</w:t>
+      </w:r>
+      <w:proofErr w:type="spellEnd"/>
+      <w:r>
+        <w:rPr>
+          <w:rFonts w:ascii="Calibri Light" w:hAnsi="Calibri Light" w:cs="Calibri Light"/>
+          <w:sz w:val="22"/>
+          <w:lang w:eastAsia="ko-KR"/>
+        </w:rPr>
+        <w:t xml:space="preserve">, W.-Y </w:t>
       </w:r>
       <w:r>
         <w:rPr>
@@ -2026,187 +2184,68 @@
           <w:sz w:val="22"/>
           <w:lang w:eastAsia="ko-KR"/>
         </w:rPr>
-        <w:t>Kwon, M.</w:t>
-      </w:r>
-      <w:r>
-        <w:rPr>
-          <w:rFonts w:ascii="Calibri Light" w:hAnsi="Calibri Light" w:cs="Calibri Light"/>
-          <w:b/>
-          <w:bCs/>
-          <w:sz w:val="22"/>
-          <w:vertAlign w:val="superscript"/>
-          <w:lang w:eastAsia="ko-KR"/>
-        </w:rPr>
-        <w:t>*</w:t>
-      </w:r>
-      <w:r>
-        <w:rPr>
-          <w:rFonts w:ascii="Calibri Light" w:hAnsi="Calibri Light" w:cs="Calibri Light"/>
-          <w:sz w:val="22"/>
-          <w:lang w:eastAsia="ko-KR"/>
-        </w:rPr>
-        <w:t xml:space="preserve">, </w:t>
-      </w:r>
-      <w:r>
-        <w:rPr>
-          <w:rFonts w:ascii="Calibri Light" w:hAnsi="Calibri Light" w:cs="Calibri Light"/>
-          <w:sz w:val="22"/>
-          <w:lang w:eastAsia="ko-KR"/>
-        </w:rPr>
-        <w:t>Choi, H</w:t>
-      </w:r>
-      <w:r>
-        <w:rPr>
-          <w:rFonts w:ascii="Calibri Light" w:hAnsi="Calibri Light" w:cs="Calibri Light"/>
-          <w:sz w:val="22"/>
-          <w:lang w:eastAsia="ko-KR"/>
-        </w:rPr>
-        <w:t>.</w:t>
-      </w:r>
-      <w:r>
-        <w:rPr>
-          <w:rFonts w:ascii="Calibri Light" w:hAnsi="Calibri Light" w:cs="Calibri Light"/>
-          <w:sz w:val="22"/>
-          <w:vertAlign w:val="superscript"/>
-          <w:lang w:eastAsia="ko-KR"/>
-        </w:rPr>
-        <w:t>*</w:t>
-      </w:r>
-      <w:r>
-        <w:rPr>
-          <w:rFonts w:ascii="Calibri Light" w:hAnsi="Calibri Light" w:cs="Calibri Light"/>
-          <w:sz w:val="22"/>
-          <w:lang w:eastAsia="ko-KR"/>
-        </w:rPr>
-        <w:t>, P</w:t>
-      </w:r>
-      <w:r>
-        <w:rPr>
-          <w:rFonts w:ascii="Calibri Light" w:hAnsi="Calibri Light" w:cs="Calibri Light"/>
-          <w:sz w:val="22"/>
-          <w:lang w:eastAsia="ko-KR"/>
-        </w:rPr>
-        <w:t>ark, H., Ahn, W.</w:t>
-      </w:r>
-      <w:r>
-        <w:rPr>
-          <w:rFonts w:ascii="Calibri Light" w:hAnsi="Calibri Light" w:cs="Calibri Light"/>
-          <w:sz w:val="22"/>
-          <w:vertAlign w:val="superscript"/>
-          <w:lang w:eastAsia="ko-KR"/>
-        </w:rPr>
-        <w:t>+</w:t>
-      </w:r>
-      <w:r>
-        <w:rPr>
-          <w:rFonts w:ascii="Calibri Light" w:hAnsi="Calibri Light" w:cs="Calibri Light"/>
-          <w:sz w:val="22"/>
-          <w:lang w:eastAsia="ko-KR"/>
-        </w:rPr>
-        <w:t>, Jung Y.</w:t>
-      </w:r>
-      <w:r>
-        <w:rPr>
-          <w:rFonts w:ascii="Calibri Light" w:hAnsi="Calibri Light" w:cs="Calibri Light"/>
-          <w:sz w:val="22"/>
-          <w:vertAlign w:val="superscript"/>
-          <w:lang w:eastAsia="ko-KR"/>
-        </w:rPr>
-        <w:t>+</w:t>
-      </w:r>
-      <w:r>
-        <w:rPr>
-          <w:rFonts w:ascii="Calibri Light" w:hAnsi="Calibri Light" w:cs="Calibri Light"/>
-          <w:sz w:val="22"/>
-          <w:lang w:eastAsia="ko-KR"/>
-        </w:rPr>
-        <w:t xml:space="preserve"> </w:t>
-      </w:r>
-      <w:r>
-        <w:rPr>
-          <w:rFonts w:ascii="Calibri Light" w:hAnsi="Calibri Light" w:cs="Calibri Light"/>
-          <w:sz w:val="22"/>
-          <w:lang w:eastAsia="ko-KR"/>
-        </w:rPr>
-        <w:t>(</w:t>
-      </w:r>
-      <w:r>
-        <w:rPr>
-          <w:rFonts w:ascii="Calibri Light" w:hAnsi="Calibri Light" w:cs="Calibri Light"/>
-          <w:sz w:val="22"/>
-          <w:lang w:eastAsia="ko-KR"/>
-        </w:rPr>
-        <w:t>2023</w:t>
-      </w:r>
-      <w:r>
-        <w:rPr>
-          <w:rFonts w:ascii="Calibri Light" w:hAnsi="Calibri Light" w:cs="Calibri Light"/>
-          <w:sz w:val="22"/>
-          <w:lang w:eastAsia="ko-KR"/>
-        </w:rPr>
-        <w:t xml:space="preserve">) </w:t>
-      </w:r>
-      <w:r>
-        <w:rPr>
-          <w:rFonts w:ascii="Calibri Light" w:hAnsi="Calibri Light" w:cs="Calibri Light"/>
-          <w:sz w:val="22"/>
-          <w:lang w:eastAsia="ko-KR"/>
-        </w:rPr>
-        <w:t xml:space="preserve">Neural correlates of goal-directed control in internet gaming disorder and alcohol use disorder, </w:t>
-      </w:r>
-      <w:r>
-        <w:rPr>
-          <w:rFonts w:ascii="Calibri Light" w:hAnsi="Calibri Light" w:cs="Calibri Light"/>
-          <w:i/>
-          <w:iCs/>
-          <w:sz w:val="22"/>
-          <w:lang w:eastAsia="ko-KR"/>
-        </w:rPr>
-        <w:t>presented</w:t>
-      </w:r>
-      <w:r>
-        <w:rPr>
-          <w:rFonts w:ascii="Calibri Light" w:hAnsi="Calibri Light" w:cs="Calibri Light"/>
-          <w:i/>
-          <w:iCs/>
-          <w:sz w:val="22"/>
-          <w:lang w:eastAsia="ko-KR"/>
-        </w:rPr>
-        <w:t xml:space="preserve"> </w:t>
-      </w:r>
-      <w:r>
-        <w:rPr>
-          <w:rFonts w:ascii="Calibri Light" w:hAnsi="Calibri Light" w:cs="Calibri Light"/>
-          <w:i/>
-          <w:iCs/>
-          <w:sz w:val="22"/>
-          <w:lang w:eastAsia="ko-KR"/>
-        </w:rPr>
-        <w:t xml:space="preserve">at </w:t>
-      </w:r>
-      <w:r>
-        <w:rPr>
-          <w:rFonts w:ascii="Calibri Light" w:hAnsi="Calibri Light" w:cs="Calibri Light"/>
-          <w:i/>
-          <w:iCs/>
-          <w:sz w:val="22"/>
-          <w:lang w:eastAsia="ko-KR"/>
-        </w:rPr>
-        <w:t>8th International Conference on Behavioral Addictions, Incheon, Korea</w:t>
-      </w:r>
-      <w:r>
-        <w:rPr>
-          <w:rFonts w:ascii="Calibri Light" w:hAnsi="Calibri Light" w:cs="Calibri Light"/>
-          <w:i/>
-          <w:iCs/>
-          <w:sz w:val="22"/>
-          <w:lang w:eastAsia="ko-KR"/>
-        </w:rPr>
-        <w:t>.</w:t>
-      </w:r>
-    </w:p>
-    <w:p>
-      <w:pPr>
+        <w:t>Kwon, M</w:t>
+      </w:r>
+      <w:r>
+        <w:rPr>
+          <w:rFonts w:ascii="Calibri Light" w:hAnsi="Calibri Light" w:cs="Calibri Light"/>
+          <w:sz w:val="22"/>
+          <w:lang w:eastAsia="ko-KR"/>
+        </w:rPr>
+        <w:t xml:space="preserve">., Lee, J.-H., Kim, H., Lee, E., </w:t>
+      </w:r>
+      <w:proofErr w:type="spellStart"/>
+      <w:r>
+        <w:rPr>
+          <w:rFonts w:ascii="Calibri Light" w:hAnsi="Calibri Light" w:cs="Calibri Light"/>
+          <w:sz w:val="22"/>
+          <w:lang w:eastAsia="ko-KR"/>
+        </w:rPr>
+        <w:t>Im</w:t>
+      </w:r>
+      <w:proofErr w:type="spellEnd"/>
+      <w:r>
+        <w:rPr>
+          <w:rFonts w:ascii="Calibri Light" w:hAnsi="Calibri Light" w:cs="Calibri Light"/>
+          <w:sz w:val="22"/>
+          <w:lang w:eastAsia="ko-KR"/>
+        </w:rPr>
+        <w:t xml:space="preserve">, J.J., Doh, H., Yang, J., Pitt, M.A., Myung, J.I., Park, H., Joh, H., &amp; </w:t>
+      </w:r>
+      <w:proofErr w:type="spellStart"/>
+      <w:r>
+        <w:rPr>
+          <w:rFonts w:ascii="Calibri Light" w:hAnsi="Calibri Light" w:cs="Calibri Light"/>
+          <w:sz w:val="22"/>
+          <w:lang w:eastAsia="ko-KR"/>
+        </w:rPr>
+        <w:t>Ahn</w:t>
+      </w:r>
+      <w:proofErr w:type="spellEnd"/>
+      <w:r>
+        <w:rPr>
+          <w:rFonts w:ascii="Calibri Light" w:hAnsi="Calibri Light" w:cs="Calibri Light"/>
+          <w:sz w:val="22"/>
+          <w:lang w:eastAsia="ko-KR"/>
+        </w:rPr>
+        <w:t xml:space="preserve">, W.-Y. (2023) Multi-modal prediction of successful smoking cessation: Insights from neural, computational, and ecological momentary assessments data, </w:t>
+      </w:r>
+      <w:r>
+        <w:rPr>
+          <w:rFonts w:ascii="Calibri Light" w:hAnsi="Calibri Light" w:cs="Calibri Light"/>
+          <w:i/>
+          <w:iCs/>
+          <w:sz w:val="22"/>
+          <w:lang w:eastAsia="ko-KR"/>
+        </w:rPr>
+        <w:t>presented at the annual meeting of the Society for Neuroscience, Washington, D.C.</w:t>
+      </w:r>
+    </w:p>
+    <w:p>
+      <w:pPr>
+        <w:tabs>
+          <w:tab w:val="right" w:pos="8640"/>
+        </w:tabs>
         <w:spacing w:after="80"/>
         <w:ind w:left="567" w:hanging="567"/>
         <w:rPr>
@@ -2223,47 +2262,18 @@
           <w:sz w:val="22"/>
           <w:lang w:eastAsia="ko-KR"/>
         </w:rPr>
-        <w:t>Kwon, M.,</w:t>
-      </w:r>
-      <w:r>
-        <w:rPr>
-          <w:rFonts w:ascii="Calibri Light" w:hAnsi="Calibri Light" w:cs="Calibri Light"/>
-          <w:sz w:val="22"/>
-          <w:lang w:eastAsia="ko-KR"/>
-        </w:rPr>
-        <w:t xml:space="preserve"> Kim, H., Yang, J., </w:t>
-      </w:r>
-      <w:r>
-        <w:rPr>
-          <w:rFonts w:ascii="Calibri Light" w:hAnsi="Calibri Light" w:cs="Calibri Light"/>
-          <w:sz w:val="22"/>
-          <w:lang w:eastAsia="ko-KR"/>
-        </w:rPr>
-        <w:t xml:space="preserve">Lee, Y., </w:t>
-      </w:r>
-      <w:r>
-        <w:rPr>
-          <w:rFonts w:ascii="Calibri Light" w:hAnsi="Calibri Light" w:cs="Calibri Light"/>
-          <w:sz w:val="22"/>
-          <w:lang w:eastAsia="ko-KR"/>
-        </w:rPr>
-        <w:t xml:space="preserve">Hur, J., Lee, T.-H., &amp; Ahn, W.-Y. </w:t>
-      </w:r>
-      <w:r>
-        <w:rPr>
-          <w:rFonts w:ascii="Calibri Light" w:hAnsi="Calibri Light" w:cs="Calibri Light"/>
-          <w:sz w:val="22"/>
-          <w:lang w:eastAsia="ko-KR"/>
-        </w:rPr>
-        <w:t xml:space="preserve">(2023) </w:t>
-      </w:r>
-      <w:r>
-        <w:rPr>
-          <w:rFonts w:ascii="Calibri Light" w:hAnsi="Calibri Light" w:cs="Calibri Light"/>
-          <w:sz w:val="22"/>
-          <w:lang w:eastAsia="ko-KR"/>
-        </w:rPr>
-        <w:t>Caffeinated soda intake in children is associated with neurobehavioral risk factors for substance misuse</w:t>
+        <w:t>Kwon, M.</w:t>
+      </w:r>
+      <w:r>
+        <w:rPr>
+          <w:rFonts w:ascii="Calibri Light" w:hAnsi="Calibri Light" w:cs="Calibri Light"/>
+          <w:b/>
+          <w:bCs/>
+          <w:sz w:val="22"/>
+          <w:vertAlign w:val="superscript"/>
+          <w:lang w:eastAsia="ko-KR"/>
+        </w:rPr>
+        <w:t>*</w:t>
       </w:r>
       <w:r>
         <w:rPr>
@@ -2276,19 +2286,181 @@
       <w:r>
         <w:rPr>
           <w:rFonts w:ascii="Calibri Light" w:hAnsi="Calibri Light" w:cs="Calibri Light"/>
-          <w:i/>
-          <w:iCs/>
-          <w:sz w:val="22"/>
-          <w:lang w:eastAsia="ko-KR"/>
-        </w:rPr>
-        <w:t>presented at 2023 Annual Conference of the Korean Psychological Association, Suwon, Korea.</w:t>
-      </w:r>
-    </w:p>
-    <w:p>
-      <w:pPr>
-        <w:tabs>
-          <w:tab w:val="right" w:pos="8640"/>
-        </w:tabs>
+          <w:sz w:val="22"/>
+          <w:lang w:eastAsia="ko-KR"/>
+        </w:rPr>
+        <w:t>Choi, H</w:t>
+      </w:r>
+      <w:r>
+        <w:rPr>
+          <w:rFonts w:ascii="Calibri Light" w:hAnsi="Calibri Light" w:cs="Calibri Light"/>
+          <w:sz w:val="22"/>
+          <w:lang w:eastAsia="ko-KR"/>
+        </w:rPr>
+        <w:t>.</w:t>
+      </w:r>
+      <w:r>
+        <w:rPr>
+          <w:rFonts w:ascii="Calibri Light" w:hAnsi="Calibri Light" w:cs="Calibri Light"/>
+          <w:sz w:val="22"/>
+          <w:vertAlign w:val="superscript"/>
+          <w:lang w:eastAsia="ko-KR"/>
+        </w:rPr>
+        <w:t>*</w:t>
+      </w:r>
+      <w:r>
+        <w:rPr>
+          <w:rFonts w:ascii="Calibri Light" w:hAnsi="Calibri Light" w:cs="Calibri Light"/>
+          <w:sz w:val="22"/>
+          <w:lang w:eastAsia="ko-KR"/>
+        </w:rPr>
+        <w:t>, P</w:t>
+      </w:r>
+      <w:r>
+        <w:rPr>
+          <w:rFonts w:ascii="Calibri Light" w:hAnsi="Calibri Light" w:cs="Calibri Light"/>
+          <w:sz w:val="22"/>
+          <w:lang w:eastAsia="ko-KR"/>
+        </w:rPr>
+        <w:t xml:space="preserve">ark, H., </w:t>
+      </w:r>
+      <w:proofErr w:type="spellStart"/>
+      <w:r>
+        <w:rPr>
+          <w:rFonts w:ascii="Calibri Light" w:hAnsi="Calibri Light" w:cs="Calibri Light"/>
+          <w:sz w:val="22"/>
+          <w:lang w:eastAsia="ko-KR"/>
+        </w:rPr>
+        <w:t>Ahn</w:t>
+      </w:r>
+      <w:proofErr w:type="spellEnd"/>
+      <w:r>
+        <w:rPr>
+          <w:rFonts w:ascii="Calibri Light" w:hAnsi="Calibri Light" w:cs="Calibri Light"/>
+          <w:sz w:val="22"/>
+          <w:lang w:eastAsia="ko-KR"/>
+        </w:rPr>
+        <w:t>, W.</w:t>
+      </w:r>
+      <w:r>
+        <w:rPr>
+          <w:rFonts w:ascii="Calibri Light" w:hAnsi="Calibri Light" w:cs="Calibri Light"/>
+          <w:sz w:val="22"/>
+          <w:vertAlign w:val="superscript"/>
+          <w:lang w:eastAsia="ko-KR"/>
+        </w:rPr>
+        <w:t>+</w:t>
+      </w:r>
+      <w:r>
+        <w:rPr>
+          <w:rFonts w:ascii="Calibri Light" w:hAnsi="Calibri Light" w:cs="Calibri Light"/>
+          <w:sz w:val="22"/>
+          <w:lang w:eastAsia="ko-KR"/>
+        </w:rPr>
+        <w:t>, Jung Y.</w:t>
+      </w:r>
+      <w:r>
+        <w:rPr>
+          <w:rFonts w:ascii="Calibri Light" w:hAnsi="Calibri Light" w:cs="Calibri Light"/>
+          <w:sz w:val="22"/>
+          <w:vertAlign w:val="superscript"/>
+          <w:lang w:eastAsia="ko-KR"/>
+        </w:rPr>
+        <w:t>+</w:t>
+      </w:r>
+      <w:r>
+        <w:rPr>
+          <w:rFonts w:ascii="Calibri Light" w:hAnsi="Calibri Light" w:cs="Calibri Light"/>
+          <w:sz w:val="22"/>
+          <w:lang w:eastAsia="ko-KR"/>
+        </w:rPr>
+        <w:t xml:space="preserve"> </w:t>
+      </w:r>
+      <w:r>
+        <w:rPr>
+          <w:rFonts w:ascii="Calibri Light" w:hAnsi="Calibri Light" w:cs="Calibri Light"/>
+          <w:sz w:val="22"/>
+          <w:lang w:eastAsia="ko-KR"/>
+        </w:rPr>
+        <w:t>(</w:t>
+      </w:r>
+      <w:r>
+        <w:rPr>
+          <w:rFonts w:ascii="Calibri Light" w:hAnsi="Calibri Light" w:cs="Calibri Light"/>
+          <w:sz w:val="22"/>
+          <w:lang w:eastAsia="ko-KR"/>
+        </w:rPr>
+        <w:t>2023</w:t>
+      </w:r>
+      <w:r>
+        <w:rPr>
+          <w:rFonts w:ascii="Calibri Light" w:hAnsi="Calibri Light" w:cs="Calibri Light"/>
+          <w:sz w:val="22"/>
+          <w:lang w:eastAsia="ko-KR"/>
+        </w:rPr>
+        <w:t xml:space="preserve">) </w:t>
+      </w:r>
+      <w:r>
+        <w:rPr>
+          <w:rFonts w:ascii="Calibri Light" w:hAnsi="Calibri Light" w:cs="Calibri Light"/>
+          <w:sz w:val="22"/>
+          <w:lang w:eastAsia="ko-KR"/>
+        </w:rPr>
+        <w:t xml:space="preserve">Neural correlates of goal-directed control in internet gaming disorder and alcohol use disorder, </w:t>
+      </w:r>
+      <w:r>
+        <w:rPr>
+          <w:rFonts w:ascii="Calibri Light" w:hAnsi="Calibri Light" w:cs="Calibri Light"/>
+          <w:i/>
+          <w:iCs/>
+          <w:sz w:val="22"/>
+          <w:lang w:eastAsia="ko-KR"/>
+        </w:rPr>
+        <w:t>presented</w:t>
+      </w:r>
+      <w:r>
+        <w:rPr>
+          <w:rFonts w:ascii="Calibri Light" w:hAnsi="Calibri Light" w:cs="Calibri Light"/>
+          <w:i/>
+          <w:iCs/>
+          <w:sz w:val="22"/>
+          <w:lang w:eastAsia="ko-KR"/>
+        </w:rPr>
+        <w:t xml:space="preserve"> </w:t>
+      </w:r>
+      <w:r>
+        <w:rPr>
+          <w:rFonts w:ascii="Calibri Light" w:hAnsi="Calibri Light" w:cs="Calibri Light"/>
+          <w:i/>
+          <w:iCs/>
+          <w:sz w:val="22"/>
+          <w:lang w:eastAsia="ko-KR"/>
+        </w:rPr>
+        <w:t xml:space="preserve">at </w:t>
+      </w:r>
+      <w:r>
+        <w:rPr>
+          <w:rFonts w:ascii="Calibri Light" w:hAnsi="Calibri Light" w:cs="Calibri Light"/>
+          <w:i/>
+          <w:iCs/>
+          <w:sz w:val="22"/>
+          <w:lang w:eastAsia="ko-KR"/>
+        </w:rPr>
+        <w:t>8th International Conference on Behavioral Addictions, Incheon, Korea</w:t>
+      </w:r>
+      <w:r>
+        <w:rPr>
+          <w:rFonts w:ascii="Calibri Light" w:hAnsi="Calibri Light" w:cs="Calibri Light"/>
+          <w:i/>
+          <w:iCs/>
+          <w:sz w:val="22"/>
+          <w:lang w:eastAsia="ko-KR"/>
+        </w:rPr>
+        <w:t>.</w:t>
+      </w:r>
+    </w:p>
+    <w:p>
+      <w:pPr>
         <w:spacing w:after="80"/>
         <w:ind w:left="567" w:hanging="567"/>
         <w:rPr>
@@ -2305,6 +2477,116 @@
           <w:sz w:val="22"/>
           <w:lang w:eastAsia="ko-KR"/>
         </w:rPr>
+        <w:t>Kwon, M.,</w:t>
+      </w:r>
+      <w:r>
+        <w:rPr>
+          <w:rFonts w:ascii="Calibri Light" w:hAnsi="Calibri Light" w:cs="Calibri Light"/>
+          <w:sz w:val="22"/>
+          <w:lang w:eastAsia="ko-KR"/>
+        </w:rPr>
+        <w:t xml:space="preserve"> Kim, H., Yang, J., </w:t>
+      </w:r>
+      <w:r>
+        <w:rPr>
+          <w:rFonts w:ascii="Calibri Light" w:hAnsi="Calibri Light" w:cs="Calibri Light"/>
+          <w:sz w:val="22"/>
+          <w:lang w:eastAsia="ko-KR"/>
+        </w:rPr>
+        <w:t xml:space="preserve">Lee, Y., </w:t>
+      </w:r>
+      <w:proofErr w:type="spellStart"/>
+      <w:r>
+        <w:rPr>
+          <w:rFonts w:ascii="Calibri Light" w:hAnsi="Calibri Light" w:cs="Calibri Light"/>
+          <w:sz w:val="22"/>
+          <w:lang w:eastAsia="ko-KR"/>
+        </w:rPr>
+        <w:t>Hur</w:t>
+      </w:r>
+      <w:proofErr w:type="spellEnd"/>
+      <w:r>
+        <w:rPr>
+          <w:rFonts w:ascii="Calibri Light" w:hAnsi="Calibri Light" w:cs="Calibri Light"/>
+          <w:sz w:val="22"/>
+          <w:lang w:eastAsia="ko-KR"/>
+        </w:rPr>
+        <w:t xml:space="preserve">, J., Lee, T.-H., &amp; </w:t>
+      </w:r>
+      <w:proofErr w:type="spellStart"/>
+      <w:r>
+        <w:rPr>
+          <w:rFonts w:ascii="Calibri Light" w:hAnsi="Calibri Light" w:cs="Calibri Light"/>
+          <w:sz w:val="22"/>
+          <w:lang w:eastAsia="ko-KR"/>
+        </w:rPr>
+        <w:t>Ahn</w:t>
+      </w:r>
+      <w:proofErr w:type="spellEnd"/>
+      <w:r>
+        <w:rPr>
+          <w:rFonts w:ascii="Calibri Light" w:hAnsi="Calibri Light" w:cs="Calibri Light"/>
+          <w:sz w:val="22"/>
+          <w:lang w:eastAsia="ko-KR"/>
+        </w:rPr>
+        <w:t xml:space="preserve">, W.-Y. </w:t>
+      </w:r>
+      <w:r>
+        <w:rPr>
+          <w:rFonts w:ascii="Calibri Light" w:hAnsi="Calibri Light" w:cs="Calibri Light"/>
+          <w:sz w:val="22"/>
+          <w:lang w:eastAsia="ko-KR"/>
+        </w:rPr>
+        <w:t xml:space="preserve">(2023) </w:t>
+      </w:r>
+      <w:r>
+        <w:rPr>
+          <w:rFonts w:ascii="Calibri Light" w:hAnsi="Calibri Light" w:cs="Calibri Light"/>
+          <w:sz w:val="22"/>
+          <w:lang w:eastAsia="ko-KR"/>
+        </w:rPr>
+        <w:t>Caffeinated soda intake in children is associated with neurobehavioral risk factors for substance misuse</w:t>
+      </w:r>
+      <w:r>
+        <w:rPr>
+          <w:rFonts w:ascii="Calibri Light" w:hAnsi="Calibri Light" w:cs="Calibri Light"/>
+          <w:sz w:val="22"/>
+          <w:lang w:eastAsia="ko-KR"/>
+        </w:rPr>
+        <w:t xml:space="preserve">, </w:t>
+      </w:r>
+      <w:r>
+        <w:rPr>
+          <w:rFonts w:ascii="Calibri Light" w:hAnsi="Calibri Light" w:cs="Calibri Light"/>
+          <w:i/>
+          <w:iCs/>
+          <w:sz w:val="22"/>
+          <w:lang w:eastAsia="ko-KR"/>
+        </w:rPr>
+        <w:t>presented at 2023 Annual Conference of the Korean Psychological Association, Suwon, Korea.</w:t>
+      </w:r>
+    </w:p>
+    <w:p>
+      <w:pPr>
+        <w:tabs>
+          <w:tab w:val="right" w:pos="8640"/>
+        </w:tabs>
+        <w:spacing w:after="80"/>
+        <w:ind w:left="567" w:hanging="567"/>
+        <w:rPr>
+          <w:rFonts w:ascii="Calibri Light" w:hAnsi="Calibri Light" w:cs="Calibri Light"/>
+          <w:sz w:val="22"/>
+          <w:lang w:eastAsia="ko-KR"/>
+        </w:rPr>
+      </w:pPr>
+      <w:r>
+        <w:rPr>
+          <w:rFonts w:ascii="Calibri Light" w:hAnsi="Calibri Light" w:cs="Calibri Light"/>
+          <w:b/>
+          <w:bCs/>
+          <w:sz w:val="22"/>
+          <w:lang w:eastAsia="ko-KR"/>
+        </w:rPr>
         <w:t>Kwon, M.</w:t>
       </w:r>
       <w:r>
@@ -2365,7 +2647,25 @@
           <w:sz w:val="22"/>
           <w:lang w:eastAsia="ko-KR"/>
         </w:rPr>
-        <w:t>ark, H., Ahn, W.</w:t>
+        <w:t xml:space="preserve">ark, H., </w:t>
+      </w:r>
+      <w:proofErr w:type="spellStart"/>
+      <w:r>
+        <w:rPr>
+          <w:rFonts w:ascii="Calibri Light" w:hAnsi="Calibri Light" w:cs="Calibri Light"/>
+          <w:sz w:val="22"/>
+          <w:lang w:eastAsia="ko-KR"/>
+        </w:rPr>
+        <w:t>Ahn</w:t>
+      </w:r>
+      <w:proofErr w:type="spellEnd"/>
+      <w:r>
+        <w:rPr>
+          <w:rFonts w:ascii="Calibri Light" w:hAnsi="Calibri Light" w:cs="Calibri Light"/>
+          <w:sz w:val="22"/>
+          <w:lang w:eastAsia="ko-KR"/>
+        </w:rPr>
+        <w:t>, W.</w:t>
       </w:r>
       <w:r>
         <w:rPr>
@@ -2562,13 +2862,41 @@
         </w:rPr>
         <w:t xml:space="preserve">Lee, Y., </w:t>
       </w:r>
-      <w:r>
-        <w:rPr>
-          <w:rFonts w:ascii="Calibri Light" w:hAnsi="Calibri Light" w:cs="Calibri Light"/>
-          <w:sz w:val="22"/>
-          <w:lang w:eastAsia="ko-KR"/>
-        </w:rPr>
-        <w:t>Hur, J., Lee, T., &amp; Ahn, W. (</w:t>
+      <w:proofErr w:type="spellStart"/>
+      <w:r>
+        <w:rPr>
+          <w:rFonts w:ascii="Calibri Light" w:hAnsi="Calibri Light" w:cs="Calibri Light"/>
+          <w:sz w:val="22"/>
+          <w:lang w:eastAsia="ko-KR"/>
+        </w:rPr>
+        <w:t>Hur</w:t>
+      </w:r>
+      <w:proofErr w:type="spellEnd"/>
+      <w:r>
+        <w:rPr>
+          <w:rFonts w:ascii="Calibri Light" w:hAnsi="Calibri Light" w:cs="Calibri Light"/>
+          <w:sz w:val="22"/>
+          <w:lang w:eastAsia="ko-KR"/>
+        </w:rPr>
+        <w:t xml:space="preserve">, J., Lee, T., &amp; </w:t>
+      </w:r>
+      <w:proofErr w:type="spellStart"/>
+      <w:r>
+        <w:rPr>
+          <w:rFonts w:ascii="Calibri Light" w:hAnsi="Calibri Light" w:cs="Calibri Light"/>
+          <w:sz w:val="22"/>
+          <w:lang w:eastAsia="ko-KR"/>
+        </w:rPr>
+        <w:t>Ahn</w:t>
+      </w:r>
+      <w:proofErr w:type="spellEnd"/>
+      <w:r>
+        <w:rPr>
+          <w:rFonts w:ascii="Calibri Light" w:hAnsi="Calibri Light" w:cs="Calibri Light"/>
+          <w:sz w:val="22"/>
+          <w:lang w:eastAsia="ko-KR"/>
+        </w:rPr>
+        <w:t>, W. (</w:t>
       </w:r>
       <w:r>
         <w:rPr>
@@ -2586,13 +2914,23 @@
         </w:rPr>
         <w:t xml:space="preserve">) </w:t>
       </w:r>
-      <w:r>
-        <w:rPr>
-          <w:rFonts w:ascii="Calibri Light" w:hAnsi="Calibri Light" w:cs="Calibri Light"/>
-          <w:sz w:val="22"/>
-          <w:lang w:eastAsia="ko-KR"/>
-        </w:rPr>
-        <w:t>Neuroforecasting exceeds self-reports in predicting cosmetic sales: an fMRI study</w:t>
+      <w:proofErr w:type="spellStart"/>
+      <w:r>
+        <w:rPr>
+          <w:rFonts w:ascii="Calibri Light" w:hAnsi="Calibri Light" w:cs="Calibri Light"/>
+          <w:sz w:val="22"/>
+          <w:lang w:eastAsia="ko-KR"/>
+        </w:rPr>
+        <w:t>Neuroforecasting</w:t>
+      </w:r>
+      <w:proofErr w:type="spellEnd"/>
+      <w:r>
+        <w:rPr>
+          <w:rFonts w:ascii="Calibri Light" w:hAnsi="Calibri Light" w:cs="Calibri Light"/>
+          <w:sz w:val="22"/>
+          <w:lang w:eastAsia="ko-KR"/>
+        </w:rPr>
+        <w:t xml:space="preserve"> exceeds self-reports in predicting cosmetic sales: an fMRI study</w:t>
       </w:r>
       <w:r>
         <w:rPr>
@@ -2695,13 +3033,41 @@
         </w:rPr>
         <w:t xml:space="preserve">Lee, Y., </w:t>
       </w:r>
-      <w:r>
-        <w:rPr>
-          <w:rFonts w:ascii="Calibri Light" w:hAnsi="Calibri Light" w:cs="Calibri Light"/>
-          <w:sz w:val="22"/>
-          <w:lang w:eastAsia="ko-KR"/>
-        </w:rPr>
-        <w:t>Hur, J., Lee, T., &amp; Ahn, W. (</w:t>
+      <w:proofErr w:type="spellStart"/>
+      <w:r>
+        <w:rPr>
+          <w:rFonts w:ascii="Calibri Light" w:hAnsi="Calibri Light" w:cs="Calibri Light"/>
+          <w:sz w:val="22"/>
+          <w:lang w:eastAsia="ko-KR"/>
+        </w:rPr>
+        <w:t>Hur</w:t>
+      </w:r>
+      <w:proofErr w:type="spellEnd"/>
+      <w:r>
+        <w:rPr>
+          <w:rFonts w:ascii="Calibri Light" w:hAnsi="Calibri Light" w:cs="Calibri Light"/>
+          <w:sz w:val="22"/>
+          <w:lang w:eastAsia="ko-KR"/>
+        </w:rPr>
+        <w:t xml:space="preserve">, J., Lee, T., &amp; </w:t>
+      </w:r>
+      <w:proofErr w:type="spellStart"/>
+      <w:r>
+        <w:rPr>
+          <w:rFonts w:ascii="Calibri Light" w:hAnsi="Calibri Light" w:cs="Calibri Light"/>
+          <w:sz w:val="22"/>
+          <w:lang w:eastAsia="ko-KR"/>
+        </w:rPr>
+        <w:t>Ahn</w:t>
+      </w:r>
+      <w:proofErr w:type="spellEnd"/>
+      <w:r>
+        <w:rPr>
+          <w:rFonts w:ascii="Calibri Light" w:hAnsi="Calibri Light" w:cs="Calibri Light"/>
+          <w:sz w:val="22"/>
+          <w:lang w:eastAsia="ko-KR"/>
+        </w:rPr>
+        <w:t>, W. (</w:t>
       </w:r>
       <w:r>
         <w:rPr>
@@ -2904,13 +3270,23 @@
         </w:rPr>
         <w:t xml:space="preserve">&amp; </w:t>
       </w:r>
-      <w:r>
-        <w:rPr>
-          <w:rFonts w:ascii="Calibri Light" w:hAnsi="Calibri Light" w:cs="Calibri Light"/>
-          <w:sz w:val="22"/>
-          <w:lang w:eastAsia="ko-KR"/>
-        </w:rPr>
-        <w:t>Ahn, W. (202</w:t>
+      <w:proofErr w:type="spellStart"/>
+      <w:r>
+        <w:rPr>
+          <w:rFonts w:ascii="Calibri Light" w:hAnsi="Calibri Light" w:cs="Calibri Light"/>
+          <w:sz w:val="22"/>
+          <w:lang w:eastAsia="ko-KR"/>
+        </w:rPr>
+        <w:t>Ahn</w:t>
+      </w:r>
+      <w:proofErr w:type="spellEnd"/>
+      <w:r>
+        <w:rPr>
+          <w:rFonts w:ascii="Calibri Light" w:hAnsi="Calibri Light" w:cs="Calibri Light"/>
+          <w:sz w:val="22"/>
+          <w:lang w:eastAsia="ko-KR"/>
+        </w:rPr>
+        <w:t>, W. (202</w:t>
       </w:r>
       <w:r>
         <w:rPr>
@@ -3052,7 +3428,25 @@
           <w:sz w:val="22"/>
           <w:lang w:eastAsia="ko-KR"/>
         </w:rPr>
-        <w:t xml:space="preserve">, Ahn, W., &amp; Jung, Y. (2020) Neural Correlates of Goal-Directed Control in Interest Gaming Disorder and Alcohol Use Disorder, </w:t>
+        <w:t xml:space="preserve">, </w:t>
+      </w:r>
+      <w:proofErr w:type="spellStart"/>
+      <w:r>
+        <w:rPr>
+          <w:rFonts w:ascii="Calibri Light" w:hAnsi="Calibri Light" w:cs="Calibri Light"/>
+          <w:sz w:val="22"/>
+          <w:lang w:eastAsia="ko-KR"/>
+        </w:rPr>
+        <w:t>Ahn</w:t>
+      </w:r>
+      <w:proofErr w:type="spellEnd"/>
+      <w:r>
+        <w:rPr>
+          <w:rFonts w:ascii="Calibri Light" w:hAnsi="Calibri Light" w:cs="Calibri Light"/>
+          <w:sz w:val="22"/>
+          <w:lang w:eastAsia="ko-KR"/>
+        </w:rPr>
+        <w:t xml:space="preserve">, W., &amp; Jung, Y. (2020) Neural Correlates of Goal-Directed Control in Interest Gaming Disorder and Alcohol Use Disorder, </w:t>
       </w:r>
       <w:r>
         <w:rPr>
@@ -3134,7 +3528,43 @@
           <w:sz w:val="22"/>
           <w:lang w:eastAsia="ko-KR"/>
         </w:rPr>
-        <w:t xml:space="preserve">, Kim, H., Yang, J., Hur, J., Lee, T., &amp; Ahn, W. (2019) Identifying behavioral and neural predictors of caffeinated soda intake in childhood using a large database from the ABCD study, </w:t>
+        <w:t xml:space="preserve">, Kim, H., Yang, J., </w:t>
+      </w:r>
+      <w:proofErr w:type="spellStart"/>
+      <w:r>
+        <w:rPr>
+          <w:rFonts w:ascii="Calibri Light" w:hAnsi="Calibri Light" w:cs="Calibri Light"/>
+          <w:sz w:val="22"/>
+          <w:lang w:eastAsia="ko-KR"/>
+        </w:rPr>
+        <w:t>Hur</w:t>
+      </w:r>
+      <w:proofErr w:type="spellEnd"/>
+      <w:r>
+        <w:rPr>
+          <w:rFonts w:ascii="Calibri Light" w:hAnsi="Calibri Light" w:cs="Calibri Light"/>
+          <w:sz w:val="22"/>
+          <w:lang w:eastAsia="ko-KR"/>
+        </w:rPr>
+        <w:t xml:space="preserve">, J., Lee, T., &amp; </w:t>
+      </w:r>
+      <w:proofErr w:type="spellStart"/>
+      <w:r>
+        <w:rPr>
+          <w:rFonts w:ascii="Calibri Light" w:hAnsi="Calibri Light" w:cs="Calibri Light"/>
+          <w:sz w:val="22"/>
+          <w:lang w:eastAsia="ko-KR"/>
+        </w:rPr>
+        <w:t>Ahn</w:t>
+      </w:r>
+      <w:proofErr w:type="spellEnd"/>
+      <w:r>
+        <w:rPr>
+          <w:rFonts w:ascii="Calibri Light" w:hAnsi="Calibri Light" w:cs="Calibri Light"/>
+          <w:sz w:val="22"/>
+          <w:lang w:eastAsia="ko-KR"/>
+        </w:rPr>
+        <w:t xml:space="preserve">, W. (2019) Identifying behavioral and neural predictors of caffeinated soda intake in childhood using a large database from the ABCD study, </w:t>
       </w:r>
       <w:r>
         <w:rPr>
@@ -3186,6 +3616,7 @@
           <w:sz w:val="22"/>
           <w:lang w:eastAsia="ko-KR"/>
         </w:rPr>
+        <w:lastRenderedPageBreak/>
         <w:t xml:space="preserve">Kim, H.+, Kim, S.+, </w:t>
       </w:r>
       <w:r>
@@ -3220,7 +3651,25 @@
           <w:sz w:val="22"/>
           <w:lang w:eastAsia="ko-KR"/>
         </w:rPr>
-        <w:t xml:space="preserve">., &amp; Ahn, W. (2019) Effects of early life stress and social resources on neurocognitive functions: A large-scale replication study, </w:t>
+        <w:t xml:space="preserve">., &amp; </w:t>
+      </w:r>
+      <w:proofErr w:type="spellStart"/>
+      <w:r>
+        <w:rPr>
+          <w:rFonts w:ascii="Calibri Light" w:hAnsi="Calibri Light" w:cs="Calibri Light"/>
+          <w:sz w:val="22"/>
+          <w:lang w:eastAsia="ko-KR"/>
+        </w:rPr>
+        <w:t>Ahn</w:t>
+      </w:r>
+      <w:proofErr w:type="spellEnd"/>
+      <w:r>
+        <w:rPr>
+          <w:rFonts w:ascii="Calibri Light" w:hAnsi="Calibri Light" w:cs="Calibri Light"/>
+          <w:sz w:val="22"/>
+          <w:lang w:eastAsia="ko-KR"/>
+        </w:rPr>
+        <w:t xml:space="preserve">, W. (2019) Effects of early life stress and social resources on neurocognitive functions: A large-scale replication study, </w:t>
       </w:r>
       <w:r>
         <w:rPr>
@@ -3564,7 +4013,18 @@
           <w:sz w:val="20"/>
           <w:szCs w:val="20"/>
         </w:rPr>
-        <w:t xml:space="preserve">Data collection and statistical analysis for functional MRI  </w:t>
+        <w:t xml:space="preserve">Data collection and statistical analysis for functional </w:t>
+      </w:r>
+      <w:proofErr w:type="gramStart"/>
+      <w:r>
+        <w:rPr>
+          <w:rFonts w:ascii="Calibri Light" w:hAnsi="Calibri Light" w:cs="Calibri Light"/>
+          <w:i/>
+          <w:iCs/>
+          <w:sz w:val="20"/>
+          <w:szCs w:val="20"/>
+        </w:rPr>
+        <w:t xml:space="preserve">MRI  </w:t>
       </w:r>
       <w:r>
         <w:rPr>
@@ -3576,6 +4036,7 @@
         </w:rPr>
         <w:tab/>
       </w:r>
+      <w:proofErr w:type="gramEnd"/>
       <w:r>
         <w:rPr>
           <w:rFonts w:ascii="Calibri Light" w:hAnsi="Calibri Light" w:cs="Calibri Light"/>
@@ -3743,7 +4204,29 @@
           <w:sz w:val="20"/>
           <w:szCs w:val="20"/>
         </w:rPr>
-        <w:t>Reinforcement Learning using the hBayesDM Package</w:t>
+        <w:t xml:space="preserve">Reinforcement Learning using the </w:t>
+      </w:r>
+      <w:proofErr w:type="spellStart"/>
+      <w:r>
+        <w:rPr>
+          <w:rFonts w:ascii="Calibri Light" w:hAnsi="Calibri Light" w:cs="Calibri Light"/>
+          <w:i/>
+          <w:iCs/>
+          <w:sz w:val="20"/>
+          <w:szCs w:val="20"/>
+        </w:rPr>
+        <w:t>hBayesDM</w:t>
+      </w:r>
+      <w:proofErr w:type="spellEnd"/>
+      <w:r>
+        <w:rPr>
+          <w:rFonts w:ascii="Calibri Light" w:hAnsi="Calibri Light" w:cs="Calibri Light"/>
+          <w:i/>
+          <w:iCs/>
+          <w:sz w:val="20"/>
+          <w:szCs w:val="20"/>
+        </w:rPr>
+        <w:t xml:space="preserve"> Package</w:t>
       </w:r>
       <w:r>
         <w:rPr>
@@ -4797,8 +5280,20 @@
           <w:sz w:val="20"/>
           <w:szCs w:val="20"/>
         </w:rPr>
-        <w:t>PI: Professor Woo-Young Ahn</w:t>
-      </w:r>
+        <w:t xml:space="preserve">PI: Professor Woo-Young </w:t>
+      </w:r>
+      <w:proofErr w:type="spellStart"/>
+      <w:r>
+        <w:rPr>
+          <w:rFonts w:ascii="Calibri Light" w:hAnsi="Calibri Light" w:cs="Calibri Light"/>
+          <w:i/>
+          <w:iCs/>
+          <w:sz w:val="20"/>
+          <w:szCs w:val="20"/>
+        </w:rPr>
+        <w:t>Ahn</w:t>
+      </w:r>
+      <w:proofErr w:type="spellEnd"/>
     </w:p>
     <w:p>
       <w:pPr>
@@ -4969,7 +5464,29 @@
           <w:sz w:val="20"/>
           <w:szCs w:val="20"/>
         </w:rPr>
-        <w:t>PI: Professor Jeanyoung Chey</w:t>
+        <w:t xml:space="preserve">PI: Professor </w:t>
+      </w:r>
+      <w:proofErr w:type="spellStart"/>
+      <w:r>
+        <w:rPr>
+          <w:rFonts w:ascii="Calibri Light" w:hAnsi="Calibri Light" w:cs="Calibri Light"/>
+          <w:i/>
+          <w:iCs/>
+          <w:sz w:val="20"/>
+          <w:szCs w:val="20"/>
+        </w:rPr>
+        <w:t>Jeanyoung</w:t>
+      </w:r>
+      <w:proofErr w:type="spellEnd"/>
+      <w:r>
+        <w:rPr>
+          <w:rFonts w:ascii="Calibri Light" w:hAnsi="Calibri Light" w:cs="Calibri Light"/>
+          <w:i/>
+          <w:iCs/>
+          <w:sz w:val="20"/>
+          <w:szCs w:val="20"/>
+        </w:rPr>
+        <w:t xml:space="preserve"> Chey</w:t>
       </w:r>
     </w:p>
     <w:p>
@@ -5149,7 +5666,29 @@
           <w:sz w:val="20"/>
           <w:szCs w:val="20"/>
         </w:rPr>
-        <w:t>PI: Research Professor Sungshin Kim</w:t>
+        <w:t xml:space="preserve">PI: Research Professor </w:t>
+      </w:r>
+      <w:proofErr w:type="spellStart"/>
+      <w:r>
+        <w:rPr>
+          <w:rFonts w:ascii="Calibri Light" w:hAnsi="Calibri Light" w:cs="Calibri Light"/>
+          <w:i/>
+          <w:iCs/>
+          <w:sz w:val="20"/>
+          <w:szCs w:val="20"/>
+        </w:rPr>
+        <w:t>Sungshin</w:t>
+      </w:r>
+      <w:proofErr w:type="spellEnd"/>
+      <w:r>
+        <w:rPr>
+          <w:rFonts w:ascii="Calibri Light" w:hAnsi="Calibri Light" w:cs="Calibri Light"/>
+          <w:i/>
+          <w:iCs/>
+          <w:sz w:val="20"/>
+          <w:szCs w:val="20"/>
+        </w:rPr>
+        <w:t xml:space="preserve"> Kim</w:t>
       </w:r>
     </w:p>
     <w:p>
@@ -6467,6 +7006,7 @@
         </w:rPr>
         <w:t xml:space="preserve">Stan, </w:t>
       </w:r>
+      <w:proofErr w:type="spellStart"/>
       <w:r>
         <w:rPr>
           <w:rFonts w:ascii="Calibri Light" w:hAnsi="Calibri Light" w:cs="Calibri Light"/>
@@ -6483,6 +7023,7 @@
         </w:rPr>
         <w:t>atlab</w:t>
       </w:r>
+      <w:proofErr w:type="spellEnd"/>
     </w:p>
     <w:p>
       <w:pPr>
@@ -6575,6 +7116,7 @@
         </w:rPr>
         <w:t xml:space="preserve"> SPM, </w:t>
       </w:r>
+      <w:proofErr w:type="spellStart"/>
       <w:r>
         <w:rPr>
           <w:rFonts w:ascii="Calibri Light" w:hAnsi="Calibri Light" w:cs="Calibri Light"/>
@@ -6589,7 +7131,16 @@
           <w:sz w:val="22"/>
           <w:szCs w:val="22"/>
         </w:rPr>
-        <w:t xml:space="preserve">ilearn </w:t>
+        <w:t>ilearn</w:t>
+      </w:r>
+      <w:proofErr w:type="spellEnd"/>
+      <w:r>
+        <w:rPr>
+          <w:rFonts w:ascii="Calibri Light" w:hAnsi="Calibri Light" w:cs="Calibri Light"/>
+          <w:sz w:val="22"/>
+          <w:szCs w:val="22"/>
+        </w:rPr>
+        <w:t xml:space="preserve"> </w:t>
       </w:r>
     </w:p>
     <w:p>
@@ -6700,8 +7251,20 @@
           <w:sz w:val="22"/>
           <w:szCs w:val="22"/>
         </w:rPr>
-        <w:t>Professor Woo-Young Ahn</w:t>
-      </w:r>
+        <w:t xml:space="preserve">Professor Woo-Young </w:t>
+      </w:r>
+      <w:proofErr w:type="spellStart"/>
+      <w:r>
+        <w:rPr>
+          <w:rFonts w:ascii="Calibri Light" w:hAnsi="Calibri Light" w:cs="Calibri Light"/>
+          <w:b/>
+          <w:bCs/>
+          <w:sz w:val="22"/>
+          <w:szCs w:val="22"/>
+        </w:rPr>
+        <w:t>Ahn</w:t>
+      </w:r>
+      <w:proofErr w:type="spellEnd"/>
     </w:p>
     <w:p>
       <w:pPr>

</xml_diff>